<commit_message>
Get the report updated to the stand from 30.09.26
</commit_message>
<xml_diff>
--- a/LabDice_Kotschnig_Eingang.docx
+++ b/LabDice_Kotschnig_Eingang.docx
@@ -64,11 +64,9 @@
         </w:rPr>
         <w:sectPr>
           <w:headerReference w:type="even" r:id="rId9"/>
-          <w:headerReference w:type="default" r:id="rId10"/>
-          <w:footerReference w:type="even" r:id="rId11"/>
-          <w:footerReference w:type="default" r:id="rId12"/>
-          <w:headerReference w:type="first" r:id="rId13"/>
-          <w:footerReference w:type="first" r:id="rId14"/>
+          <w:footerReference w:type="default" r:id="rId10"/>
+          <w:headerReference w:type="first" r:id="rId11"/>
+          <w:footerReference w:type="first" r:id="rId12"/>
           <w:pgSz w:w="11906" w:h="16838" w:code="9"/>
           <w:pgMar w:top="1701" w:right="1418" w:bottom="2268" w:left="1418" w:header="1134" w:footer="1701" w:gutter="0"/>
           <w:cols w:space="708"/>
@@ -169,31 +167,43 @@
                               <w:pStyle w:val="DeckblattUntertitel"/>
                               <w:rPr>
                                 <w:b w:val="0"/>
+                                <w:lang w:val="de-AT"/>
                               </w:rPr>
                             </w:pPr>
                             <w:r>
                               <w:rPr>
                                 <w:b w:val="0"/>
+                                <w:lang w:val="de-AT"/>
                               </w:rPr>
                               <w:t>K</w:t>
                             </w:r>
                             <w:r>
                               <w:rPr>
                                 <w:b w:val="0"/>
+                                <w:lang w:val="de-AT"/>
                               </w:rPr>
                               <w:t>ot</w:t>
                             </w:r>
                             <w:r>
                               <w:rPr>
                                 <w:b w:val="0"/>
+                                <w:lang w:val="de-AT"/>
                               </w:rPr>
                               <w:t>schnig Thomas</w:t>
                             </w:r>
                             <w:r>
                               <w:rPr>
                                 <w:b w:val="0"/>
+                                <w:lang w:val="de-AT"/>
                               </w:rPr>
-                              <w:t>, Eingang Fabian</w:t>
+                              <w:t>,</w:t>
+                            </w:r>
+                            <w:r>
+                              <w:rPr>
+                                <w:b w:val="0"/>
+                                <w:lang w:val="de-AT"/>
+                              </w:rPr>
+                              <w:t xml:space="preserve"> Eingang Fabian</w:t>
                             </w:r>
                           </w:p>
                           <w:p>
@@ -204,30 +214,14 @@
                                 <w:bCs/>
                                 <w:sz w:val="24"/>
                                 <w:szCs w:val="24"/>
+                                <w:lang w:val="de-AT"/>
                               </w:rPr>
                             </w:pPr>
                             <w:r>
+                              <w:rPr>
+                                <w:lang w:val="de-AT"/>
+                              </w:rPr>
                               <w:t xml:space="preserve"> </w:t>
-                            </w:r>
-                            <w:proofErr w:type="spellStart"/>
-                            <w:r>
-                              <w:rPr>
-                                <w:b w:val="0"/>
-                                <w:bCs/>
-                                <w:sz w:val="24"/>
-                                <w:szCs w:val="24"/>
-                              </w:rPr>
-                              <w:t>durchgeführt</w:t>
-                            </w:r>
-                            <w:proofErr w:type="spellEnd"/>
-                            <w:r>
-                              <w:rPr>
-                                <w:b w:val="0"/>
-                                <w:bCs/>
-                                <w:sz w:val="24"/>
-                                <w:szCs w:val="24"/>
-                              </w:rPr>
-                              <w:t xml:space="preserve">, am: </w:t>
                             </w:r>
                             <w:r>
                               <w:rPr>
@@ -235,6 +229,17 @@
                                 <w:bCs/>
                                 <w:sz w:val="24"/>
                                 <w:szCs w:val="24"/>
+                                <w:lang w:val="de-AT"/>
+                              </w:rPr>
+                              <w:t xml:space="preserve">durchgeführt, am: </w:t>
+                            </w:r>
+                            <w:r>
+                              <w:rPr>
+                                <w:b w:val="0"/>
+                                <w:bCs/>
+                                <w:sz w:val="24"/>
+                                <w:szCs w:val="24"/>
+                                <w:lang w:val="de-AT"/>
                               </w:rPr>
                               <w:t>17.10.2022</w:t>
                             </w:r>
@@ -321,31 +326,43 @@
                         <w:pStyle w:val="DeckblattUntertitel"/>
                         <w:rPr>
                           <w:b w:val="0"/>
+                          <w:lang w:val="de-AT"/>
                         </w:rPr>
                       </w:pPr>
                       <w:r>
                         <w:rPr>
                           <w:b w:val="0"/>
+                          <w:lang w:val="de-AT"/>
                         </w:rPr>
                         <w:t>K</w:t>
                       </w:r>
                       <w:r>
                         <w:rPr>
                           <w:b w:val="0"/>
+                          <w:lang w:val="de-AT"/>
                         </w:rPr>
                         <w:t>ot</w:t>
                       </w:r>
                       <w:r>
                         <w:rPr>
                           <w:b w:val="0"/>
+                          <w:lang w:val="de-AT"/>
                         </w:rPr>
                         <w:t>schnig Thomas</w:t>
                       </w:r>
                       <w:r>
                         <w:rPr>
                           <w:b w:val="0"/>
+                          <w:lang w:val="de-AT"/>
                         </w:rPr>
-                        <w:t>, Eingang Fabian</w:t>
+                        <w:t>,</w:t>
+                      </w:r>
+                      <w:r>
+                        <w:rPr>
+                          <w:b w:val="0"/>
+                          <w:lang w:val="de-AT"/>
+                        </w:rPr>
+                        <w:t xml:space="preserve"> Eingang Fabian</w:t>
                       </w:r>
                     </w:p>
                     <w:p>
@@ -356,30 +373,14 @@
                           <w:bCs/>
                           <w:sz w:val="24"/>
                           <w:szCs w:val="24"/>
+                          <w:lang w:val="de-AT"/>
                         </w:rPr>
                       </w:pPr>
                       <w:r>
+                        <w:rPr>
+                          <w:lang w:val="de-AT"/>
+                        </w:rPr>
                         <w:t xml:space="preserve"> </w:t>
-                      </w:r>
-                      <w:proofErr w:type="spellStart"/>
-                      <w:r>
-                        <w:rPr>
-                          <w:b w:val="0"/>
-                          <w:bCs/>
-                          <w:sz w:val="24"/>
-                          <w:szCs w:val="24"/>
-                        </w:rPr>
-                        <w:t>durchgeführt</w:t>
-                      </w:r>
-                      <w:proofErr w:type="spellEnd"/>
-                      <w:r>
-                        <w:rPr>
-                          <w:b w:val="0"/>
-                          <w:bCs/>
-                          <w:sz w:val="24"/>
-                          <w:szCs w:val="24"/>
-                        </w:rPr>
-                        <w:t xml:space="preserve">, am: </w:t>
                       </w:r>
                       <w:r>
                         <w:rPr>
@@ -387,6 +388,17 @@
                           <w:bCs/>
                           <w:sz w:val="24"/>
                           <w:szCs w:val="24"/>
+                          <w:lang w:val="de-AT"/>
+                        </w:rPr>
+                        <w:t xml:space="preserve">durchgeführt, am: </w:t>
+                      </w:r>
+                      <w:r>
+                        <w:rPr>
+                          <w:b w:val="0"/>
+                          <w:bCs/>
+                          <w:sz w:val="24"/>
+                          <w:szCs w:val="24"/>
+                          <w:lang w:val="de-AT"/>
                         </w:rPr>
                         <w:t>17.10.2022</w:t>
                       </w:r>
@@ -1005,9 +1017,9 @@
           <w:lang w:val="en-US"/>
         </w:rPr>
         <w:sectPr>
-          <w:headerReference w:type="default" r:id="rId15"/>
-          <w:footerReference w:type="default" r:id="rId16"/>
-          <w:footerReference w:type="first" r:id="rId17"/>
+          <w:headerReference w:type="default" r:id="rId13"/>
+          <w:footerReference w:type="default" r:id="rId14"/>
+          <w:footerReference w:type="first" r:id="rId15"/>
           <w:pgSz w:w="11906" w:h="16838" w:code="9"/>
           <w:pgMar w:top="1701" w:right="1418" w:bottom="2268" w:left="1418" w:header="1134" w:footer="1701" w:gutter="0"/>
           <w:pgNumType w:fmt="lowerRoman" w:start="1"/>
@@ -1033,8 +1045,6 @@
           <w:lang w:val="en-US"/>
         </w:rPr>
       </w:pPr>
-      <w:bookmarkStart w:id="0" w:name="_Toc216095050"/>
-      <w:bookmarkStart w:id="1" w:name="_Toc216367279"/>
       <w:r>
         <w:rPr>
           <w:sz w:val="36"/>
@@ -1042,10 +1052,8 @@
           <w:lang w:val="en-US"/>
         </w:rPr>
         <w:lastRenderedPageBreak/>
-        <w:t>Task description</w:t>
-      </w:r>
-      <w:bookmarkEnd w:id="0"/>
-      <w:bookmarkEnd w:id="1"/>
+        <w:t>Task Description</w:t>
+      </w:r>
     </w:p>
     <w:p>
       <w:pPr>
@@ -1063,143 +1071,510 @@
         <w:t>dice</w:t>
       </w:r>
       <w:r>
-        <w:t>s</w:t>
-      </w:r>
-      <w:r>
-        <w:t xml:space="preserve"> </w:t>
-      </w:r>
-      <w:r>
-        <w:t>were</w:t>
+        <w:t>s were</w:t>
       </w:r>
       <w:r>
         <w:t xml:space="preserve"> implemented on the BASYS3 FPGA board.</w:t>
       </w:r>
       <w:r>
-        <w:t xml:space="preserve"> In the task description a </w:t>
-      </w:r>
-      <w:r>
-        <w:t>compile able</w:t>
-      </w:r>
-      <w:r>
-        <w:t xml:space="preserve"> </w:t>
-      </w:r>
-      <w:proofErr w:type="spellStart"/>
+        <w:t xml:space="preserve"> In the task description a compile able </w:t>
+      </w:r>
       <w:r>
         <w:t>SystemVerilog</w:t>
       </w:r>
-      <w:proofErr w:type="spellEnd"/>
-      <w:r>
-        <w:t xml:space="preserve"> </w:t>
-      </w:r>
-      <w:r>
-        <w:t>project was provided. In this pro</w:t>
-      </w:r>
-      <w:r>
-        <w:t>ject it was necessary to implement a pseudo-random functionality to</w:t>
-      </w:r>
-      <w:r>
-        <w:t xml:space="preserve"> simulate a “fair” dice. </w:t>
-      </w:r>
-      <w:r>
-        <w:t>In the project, u</w:t>
+      <w:r>
+        <w:t xml:space="preserve"> project was provided. In this project it was necessary to implement a pseudo-random functionality to simulate a “fair” dice. In the project, u</w:t>
       </w:r>
       <w:r>
         <w:t>p to four independent dice can be enabled via switches</w:t>
       </w:r>
       <w:r>
-        <w:t>.</w:t>
-      </w:r>
-      <w:r>
-        <w:t xml:space="preserve"> </w:t>
-      </w:r>
-      <w:r>
-        <w:t>O</w:t>
-      </w:r>
-      <w:r>
-        <w:t>ne</w:t>
-      </w:r>
-      <w:r>
-        <w:t xml:space="preserve"> additional switch </w:t>
-      </w:r>
-      <w:r>
-        <w:t>has</w:t>
-      </w:r>
-      <w:r>
-        <w:t xml:space="preserve"> been implemented to </w:t>
-      </w:r>
-      <w:r>
-        <w:t xml:space="preserve">reset the system with an active low reset signal and </w:t>
-      </w:r>
-      <w:r>
-        <w:t xml:space="preserve">a button on the </w:t>
-      </w:r>
-      <w:r>
-        <w:t>FPGA</w:t>
-      </w:r>
-      <w:r>
-        <w:t xml:space="preserve">-board </w:t>
-      </w:r>
-      <w:r>
-        <w:t xml:space="preserve">is used to </w:t>
-      </w:r>
-      <w:r>
-        <w:t xml:space="preserve">simulate </w:t>
-      </w:r>
-      <w:r>
-        <w:t>a “throw” of the activated dices</w:t>
-      </w:r>
-      <w:r>
-        <w:t xml:space="preserve">. The implemented design was first </w:t>
-      </w:r>
-      <w:r>
-        <w:t>verified using the provided testbench</w:t>
-      </w:r>
-      <w:r>
-        <w:t xml:space="preserve"> and then</w:t>
-      </w:r>
-      <w:r>
-        <w:t xml:space="preserve"> synthesized and tested on the physical hardware.</w:t>
-      </w:r>
-      <w:r>
-        <w:rPr>
-          <w:lang w:val="en-US"/>
-        </w:rPr>
-        <w:br w:type="page"/>
+        <w:t xml:space="preserve"> (sw0- sw3). One additional switch (sw4) has been implemented to reset the system with an active low reset signal and a button (btnC) on the FPGA-board is used to simulate a “throw” of the activated dices.  The result of the dice rolling is displayed with the seven-segment integrated on the BASYS3 FPGA board.</w:t>
       </w:r>
     </w:p>
     <w:p>
       <w:pPr>
         <w:pStyle w:val="berschrift1"/>
-        <w:jc w:val="left"/>
-        <w:rPr>
-          <w:sz w:val="36"/>
-          <w:szCs w:val="24"/>
+        <w:rPr>
+          <w:sz w:val="22"/>
+          <w:szCs w:val="22"/>
+        </w:rPr>
+      </w:pPr>
+      <w:r>
+        <w:rPr>
           <w:lang w:val="en-US"/>
         </w:rPr>
-      </w:pPr>
-      <w:bookmarkStart w:id="2" w:name="_Toc216095051"/>
-      <w:bookmarkStart w:id="3" w:name="_Toc216367280"/>
-      <w:bookmarkStart w:id="4" w:name="_Ref118219121"/>
-      <w:bookmarkStart w:id="5" w:name="_Ref118219128"/>
-      <w:bookmarkStart w:id="6" w:name="_Ref118219135"/>
-      <w:r>
-        <w:rPr>
-          <w:sz w:val="36"/>
-          <w:szCs w:val="24"/>
+        <w:t>L</w:t>
+      </w:r>
+      <w:r>
+        <w:rPr>
+          <w:lang w:val="en-US"/>
+        </w:rPr>
+        <w:t>aboratory 1: Block Design</w:t>
+      </w:r>
+    </w:p>
+    <w:p>
+      <w:pPr>
+        <w:pStyle w:val="berschrift2"/>
+        <w:rPr>
+          <w:lang w:val="en-US"/>
+        </w:rPr>
+      </w:pPr>
+      <w:r>
+        <w:rPr>
+          <w:lang w:val="en-US"/>
+        </w:rPr>
+        <w:t>Task Description</w:t>
+      </w:r>
+      <w:bookmarkStart w:id="0" w:name="_Ref118219121"/>
+      <w:bookmarkStart w:id="1" w:name="_Ref118219128"/>
+      <w:bookmarkStart w:id="2" w:name="_Ref118219135"/>
+      <w:bookmarkStart w:id="3" w:name="_Toc216095051"/>
+      <w:bookmarkStart w:id="4" w:name="_Toc216367280"/>
+    </w:p>
+    <w:p>
+      <w:pPr>
+        <w:rPr>
+          <w:lang w:val="en-US"/>
+        </w:rPr>
+      </w:pPr>
+      <w:r>
+        <w:rPr>
+          <w:lang w:val="en-US"/>
+        </w:rPr>
+        <w:t>As the first step of the dice implementation a block design needs to be created. Since a ke</w:t>
+      </w:r>
+      <w:r>
+        <w:rPr>
+          <w:lang w:val="en-US"/>
+        </w:rPr>
+        <w:t>y attribute of SoC design is to re-use existing IP, the task of the first laboratory was to build the skeleton  of the dice with the existing IP which will be used.</w:t>
+      </w:r>
+    </w:p>
+    <w:p>
+      <w:pPr>
+        <w:rPr>
+          <w:lang w:val="en-US"/>
+        </w:rPr>
+      </w:pPr>
+    </w:p>
+    <w:p>
+      <w:pPr>
+        <w:pStyle w:val="Beschriftung"/>
+        <w:keepNext/>
+      </w:pPr>
+      <w:r>
+        <w:t xml:space="preserve">Table </w:t>
+      </w:r>
+      <w:r>
+        <w:fldChar w:fldCharType="begin"/>
+      </w:r>
+      <w:r>
+        <w:instrText xml:space="preserve"> STYLEREF 1 \s </w:instrText>
+      </w:r>
+      <w:r>
+        <w:fldChar w:fldCharType="separate"/>
+      </w:r>
+      <w:r>
+        <w:rPr>
+          <w:noProof/>
+        </w:rPr>
+        <w:t>2</w:t>
+      </w:r>
+      <w:r>
+        <w:fldChar w:fldCharType="end"/>
+      </w:r>
+      <w:r>
+        <w:t>.</w:t>
+      </w:r>
+      <w:r>
+        <w:fldChar w:fldCharType="begin"/>
+      </w:r>
+      <w:r>
+        <w:instrText xml:space="preserve"> SEQ Table \* ARABIC \s 1 </w:instrText>
+      </w:r>
+      <w:r>
+        <w:fldChar w:fldCharType="separate"/>
+      </w:r>
+      <w:r>
+        <w:rPr>
+          <w:noProof/>
+        </w:rPr>
+        <w:t>1</w:t>
+      </w:r>
+      <w:r>
+        <w:fldChar w:fldCharType="end"/>
+      </w:r>
+      <w:r>
+        <w:t>: Existing IP used to create the skeleton for the dice as a SoC</w:t>
+      </w:r>
+    </w:p>
+    <w:tbl>
+      <w:tblPr>
+        <w:tblStyle w:val="Gitternetztabelle4Akzent1"/>
+        <w:tblW w:w="0" w:type="auto"/>
+        <w:jc w:val="center"/>
+        <w:tblLook w:val="04A0" w:firstRow="1" w:lastRow="0" w:firstColumn="1" w:lastColumn="0" w:noHBand="0" w:noVBand="1"/>
+      </w:tblPr>
+      <w:tblGrid>
+        <w:gridCol w:w="4887"/>
+      </w:tblGrid>
+      <w:tr>
+        <w:trPr>
+          <w:cnfStyle w:val="100000000000" w:firstRow="1" w:lastRow="0" w:firstColumn="0" w:lastColumn="0" w:oddVBand="0" w:evenVBand="0" w:oddHBand="0" w:evenHBand="0" w:firstRowFirstColumn="0" w:firstRowLastColumn="0" w:lastRowFirstColumn="0" w:lastRowLastColumn="0"/>
+          <w:trHeight w:hRule="exact" w:val="397"/>
+          <w:jc w:val="center"/>
+        </w:trPr>
+        <w:tc>
+          <w:tcPr>
+            <w:cnfStyle w:val="001000000000" w:firstRow="0" w:lastRow="0" w:firstColumn="1" w:lastColumn="0" w:oddVBand="0" w:evenVBand="0" w:oddHBand="0" w:evenHBand="0" w:firstRowFirstColumn="0" w:firstRowLastColumn="0" w:lastRowFirstColumn="0" w:lastRowLastColumn="0"/>
+            <w:tcW w:w="4887" w:type="dxa"/>
+          </w:tcPr>
+          <w:p>
+            <w:pPr>
+              <w:jc w:val="center"/>
+              <w:rPr>
+                <w:lang w:val="en-US"/>
+              </w:rPr>
+            </w:pPr>
+            <w:r>
+              <w:rPr>
+                <w:lang w:val="en-US"/>
+              </w:rPr>
+              <w:t>Used IP in the block design</w:t>
+            </w:r>
+          </w:p>
+        </w:tc>
+      </w:tr>
+      <w:tr>
+        <w:trPr>
+          <w:cnfStyle w:val="000000100000" w:firstRow="0" w:lastRow="0" w:firstColumn="0" w:lastColumn="0" w:oddVBand="0" w:evenVBand="0" w:oddHBand="1" w:evenHBand="0" w:firstRowFirstColumn="0" w:firstRowLastColumn="0" w:lastRowFirstColumn="0" w:lastRowLastColumn="0"/>
+          <w:trHeight w:hRule="exact" w:val="397"/>
+          <w:jc w:val="center"/>
+        </w:trPr>
+        <w:tc>
+          <w:tcPr>
+            <w:cnfStyle w:val="001000000000" w:firstRow="0" w:lastRow="0" w:firstColumn="1" w:lastColumn="0" w:oddVBand="0" w:evenVBand="0" w:oddHBand="0" w:evenHBand="0" w:firstRowFirstColumn="0" w:firstRowLastColumn="0" w:lastRowFirstColumn="0" w:lastRowLastColumn="0"/>
+            <w:tcW w:w="4887" w:type="dxa"/>
+          </w:tcPr>
+          <w:p>
+            <w:pPr>
+              <w:jc w:val="center"/>
+              <w:rPr>
+                <w:b w:val="0"/>
+                <w:lang w:val="en-US"/>
+              </w:rPr>
+            </w:pPr>
+            <w:r>
+              <w:rPr>
+                <w:b w:val="0"/>
+              </w:rPr>
+              <w:t>MicroBlaze</w:t>
+            </w:r>
+          </w:p>
+        </w:tc>
+      </w:tr>
+      <w:tr>
+        <w:trPr>
+          <w:trHeight w:hRule="exact" w:val="397"/>
+          <w:jc w:val="center"/>
+        </w:trPr>
+        <w:tc>
+          <w:tcPr>
+            <w:cnfStyle w:val="001000000000" w:firstRow="0" w:lastRow="0" w:firstColumn="1" w:lastColumn="0" w:oddVBand="0" w:evenVBand="0" w:oddHBand="0" w:evenHBand="0" w:firstRowFirstColumn="0" w:firstRowLastColumn="0" w:lastRowFirstColumn="0" w:lastRowLastColumn="0"/>
+            <w:tcW w:w="4887" w:type="dxa"/>
+          </w:tcPr>
+          <w:p>
+            <w:pPr>
+              <w:jc w:val="center"/>
+              <w:rPr>
+                <w:b w:val="0"/>
+                <w:lang w:val="en-US"/>
+              </w:rPr>
+            </w:pPr>
+            <w:r>
+              <w:rPr>
+                <w:b w:val="0"/>
+              </w:rPr>
+              <w:t>Processor System Reset</w:t>
+            </w:r>
+          </w:p>
+        </w:tc>
+      </w:tr>
+      <w:tr>
+        <w:trPr>
+          <w:cnfStyle w:val="000000100000" w:firstRow="0" w:lastRow="0" w:firstColumn="0" w:lastColumn="0" w:oddVBand="0" w:evenVBand="0" w:oddHBand="1" w:evenHBand="0" w:firstRowFirstColumn="0" w:firstRowLastColumn="0" w:lastRowFirstColumn="0" w:lastRowLastColumn="0"/>
+          <w:trHeight w:hRule="exact" w:val="397"/>
+          <w:jc w:val="center"/>
+        </w:trPr>
+        <w:tc>
+          <w:tcPr>
+            <w:cnfStyle w:val="001000000000" w:firstRow="0" w:lastRow="0" w:firstColumn="1" w:lastColumn="0" w:oddVBand="0" w:evenVBand="0" w:oddHBand="0" w:evenHBand="0" w:firstRowFirstColumn="0" w:firstRowLastColumn="0" w:lastRowFirstColumn="0" w:lastRowLastColumn="0"/>
+            <w:tcW w:w="4887" w:type="dxa"/>
+          </w:tcPr>
+          <w:p>
+            <w:pPr>
+              <w:jc w:val="center"/>
+              <w:rPr>
+                <w:b w:val="0"/>
+                <w:lang w:val="en-US"/>
+              </w:rPr>
+            </w:pPr>
+            <w:r>
+              <w:rPr>
+                <w:b w:val="0"/>
+              </w:rPr>
+              <w:t>MicroBlaze Debug Module</w:t>
+            </w:r>
+          </w:p>
+        </w:tc>
+      </w:tr>
+      <w:tr>
+        <w:trPr>
+          <w:trHeight w:hRule="exact" w:val="397"/>
+          <w:jc w:val="center"/>
+        </w:trPr>
+        <w:tc>
+          <w:tcPr>
+            <w:cnfStyle w:val="001000000000" w:firstRow="0" w:lastRow="0" w:firstColumn="1" w:lastColumn="0" w:oddVBand="0" w:evenVBand="0" w:oddHBand="0" w:evenHBand="0" w:firstRowFirstColumn="0" w:firstRowLastColumn="0" w:lastRowFirstColumn="0" w:lastRowLastColumn="0"/>
+            <w:tcW w:w="4887" w:type="dxa"/>
+          </w:tcPr>
+          <w:p>
+            <w:pPr>
+              <w:jc w:val="center"/>
+              <w:rPr>
+                <w:b w:val="0"/>
+                <w:lang w:val="en-US"/>
+              </w:rPr>
+            </w:pPr>
+            <w:r>
+              <w:rPr>
+                <w:b w:val="0"/>
+              </w:rPr>
+              <w:t>AXI Interrupt Controller</w:t>
+            </w:r>
+          </w:p>
+        </w:tc>
+      </w:tr>
+      <w:tr>
+        <w:trPr>
+          <w:cnfStyle w:val="000000100000" w:firstRow="0" w:lastRow="0" w:firstColumn="0" w:lastColumn="0" w:oddVBand="0" w:evenVBand="0" w:oddHBand="1" w:evenHBand="0" w:firstRowFirstColumn="0" w:firstRowLastColumn="0" w:lastRowFirstColumn="0" w:lastRowLastColumn="0"/>
+          <w:trHeight w:hRule="exact" w:val="397"/>
+          <w:jc w:val="center"/>
+        </w:trPr>
+        <w:tc>
+          <w:tcPr>
+            <w:cnfStyle w:val="001000000000" w:firstRow="0" w:lastRow="0" w:firstColumn="1" w:lastColumn="0" w:oddVBand="0" w:evenVBand="0" w:oddHBand="0" w:evenHBand="0" w:firstRowFirstColumn="0" w:firstRowLastColumn="0" w:lastRowFirstColumn="0" w:lastRowLastColumn="0"/>
+            <w:tcW w:w="4887" w:type="dxa"/>
+          </w:tcPr>
+          <w:p>
+            <w:pPr>
+              <w:jc w:val="center"/>
+              <w:rPr>
+                <w:b w:val="0"/>
+              </w:rPr>
+            </w:pPr>
+            <w:r>
+              <w:rPr>
+                <w:b w:val="0"/>
+              </w:rPr>
+              <w:t>LMB BRAM Controller</w:t>
+            </w:r>
+          </w:p>
+        </w:tc>
+      </w:tr>
+      <w:tr>
+        <w:trPr>
+          <w:trHeight w:hRule="exact" w:val="397"/>
+          <w:jc w:val="center"/>
+        </w:trPr>
+        <w:tc>
+          <w:tcPr>
+            <w:cnfStyle w:val="001000000000" w:firstRow="0" w:lastRow="0" w:firstColumn="1" w:lastColumn="0" w:oddVBand="0" w:evenVBand="0" w:oddHBand="0" w:evenHBand="0" w:firstRowFirstColumn="0" w:firstRowLastColumn="0" w:lastRowFirstColumn="0" w:lastRowLastColumn="0"/>
+            <w:tcW w:w="4887" w:type="dxa"/>
+          </w:tcPr>
+          <w:p>
+            <w:pPr>
+              <w:jc w:val="center"/>
+              <w:rPr>
+                <w:b w:val="0"/>
+              </w:rPr>
+            </w:pPr>
+            <w:r>
+              <w:rPr>
+                <w:b w:val="0"/>
+              </w:rPr>
+              <w:t>AXI Uartlite</w:t>
+            </w:r>
+          </w:p>
+        </w:tc>
+      </w:tr>
+      <w:tr>
+        <w:trPr>
+          <w:cnfStyle w:val="000000100000" w:firstRow="0" w:lastRow="0" w:firstColumn="0" w:lastColumn="0" w:oddVBand="0" w:evenVBand="0" w:oddHBand="1" w:evenHBand="0" w:firstRowFirstColumn="0" w:firstRowLastColumn="0" w:lastRowFirstColumn="0" w:lastRowLastColumn="0"/>
+          <w:trHeight w:hRule="exact" w:val="397"/>
+          <w:jc w:val="center"/>
+        </w:trPr>
+        <w:tc>
+          <w:tcPr>
+            <w:cnfStyle w:val="001000000000" w:firstRow="0" w:lastRow="0" w:firstColumn="1" w:lastColumn="0" w:oddVBand="0" w:evenVBand="0" w:oddHBand="0" w:evenHBand="0" w:firstRowFirstColumn="0" w:firstRowLastColumn="0" w:lastRowFirstColumn="0" w:lastRowLastColumn="0"/>
+            <w:tcW w:w="4887" w:type="dxa"/>
+          </w:tcPr>
+          <w:p>
+            <w:pPr>
+              <w:jc w:val="center"/>
+              <w:rPr>
+                <w:b w:val="0"/>
+              </w:rPr>
+            </w:pPr>
+            <w:r>
+              <w:rPr>
+                <w:b w:val="0"/>
+              </w:rPr>
+              <w:t>AXI APB Bridge</w:t>
+            </w:r>
+          </w:p>
+        </w:tc>
+      </w:tr>
+      <w:tr>
+        <w:trPr>
+          <w:trHeight w:hRule="exact" w:val="397"/>
+          <w:jc w:val="center"/>
+        </w:trPr>
+        <w:tc>
+          <w:tcPr>
+            <w:cnfStyle w:val="001000000000" w:firstRow="0" w:lastRow="0" w:firstColumn="1" w:lastColumn="0" w:oddVBand="0" w:evenVBand="0" w:oddHBand="0" w:evenHBand="0" w:firstRowFirstColumn="0" w:firstRowLastColumn="0" w:lastRowFirstColumn="0" w:lastRowLastColumn="0"/>
+            <w:tcW w:w="4887" w:type="dxa"/>
+          </w:tcPr>
+          <w:p>
+            <w:pPr>
+              <w:jc w:val="center"/>
+              <w:rPr>
+                <w:b w:val="0"/>
+              </w:rPr>
+            </w:pPr>
+            <w:r>
+              <w:rPr>
+                <w:b w:val="0"/>
+              </w:rPr>
+              <w:t>AXI GPIO</w:t>
+            </w:r>
+          </w:p>
+        </w:tc>
+      </w:tr>
+      <w:tr>
+        <w:trPr>
+          <w:cnfStyle w:val="000000100000" w:firstRow="0" w:lastRow="0" w:firstColumn="0" w:lastColumn="0" w:oddVBand="0" w:evenVBand="0" w:oddHBand="1" w:evenHBand="0" w:firstRowFirstColumn="0" w:firstRowLastColumn="0" w:lastRowFirstColumn="0" w:lastRowLastColumn="0"/>
+          <w:trHeight w:hRule="exact" w:val="397"/>
+          <w:jc w:val="center"/>
+        </w:trPr>
+        <w:tc>
+          <w:tcPr>
+            <w:cnfStyle w:val="001000000000" w:firstRow="0" w:lastRow="0" w:firstColumn="1" w:lastColumn="0" w:oddVBand="0" w:evenVBand="0" w:oddHBand="0" w:evenHBand="0" w:firstRowFirstColumn="0" w:firstRowLastColumn="0" w:lastRowFirstColumn="0" w:lastRowLastColumn="0"/>
+            <w:tcW w:w="4887" w:type="dxa"/>
+          </w:tcPr>
+          <w:p>
+            <w:pPr>
+              <w:jc w:val="center"/>
+              <w:rPr>
+                <w:b w:val="0"/>
+              </w:rPr>
+            </w:pPr>
+            <w:r>
+              <w:rPr>
+                <w:b w:val="0"/>
+              </w:rPr>
+              <w:t>AXI Crossbar</w:t>
+            </w:r>
+          </w:p>
+        </w:tc>
+      </w:tr>
+      <w:tr>
+        <w:trPr>
+          <w:trHeight w:hRule="exact" w:val="397"/>
+          <w:jc w:val="center"/>
+        </w:trPr>
+        <w:tc>
+          <w:tcPr>
+            <w:cnfStyle w:val="001000000000" w:firstRow="0" w:lastRow="0" w:firstColumn="1" w:lastColumn="0" w:oddVBand="0" w:evenVBand="0" w:oddHBand="0" w:evenHBand="0" w:firstRowFirstColumn="0" w:firstRowLastColumn="0" w:lastRowFirstColumn="0" w:lastRowLastColumn="0"/>
+            <w:tcW w:w="4887" w:type="dxa"/>
+          </w:tcPr>
+          <w:p>
+            <w:pPr>
+              <w:jc w:val="center"/>
+              <w:rPr>
+                <w:b w:val="0"/>
+              </w:rPr>
+            </w:pPr>
+            <w:r>
+              <w:rPr>
+                <w:b w:val="0"/>
+              </w:rPr>
+              <w:t>AXI Timer</w:t>
+            </w:r>
+          </w:p>
+        </w:tc>
+      </w:tr>
+      <w:tr>
+        <w:trPr>
+          <w:cnfStyle w:val="000000100000" w:firstRow="0" w:lastRow="0" w:firstColumn="0" w:lastColumn="0" w:oddVBand="0" w:evenVBand="0" w:oddHBand="1" w:evenHBand="0" w:firstRowFirstColumn="0" w:firstRowLastColumn="0" w:lastRowFirstColumn="0" w:lastRowLastColumn="0"/>
+          <w:trHeight w:hRule="exact" w:val="397"/>
+          <w:jc w:val="center"/>
+        </w:trPr>
+        <w:tc>
+          <w:tcPr>
+            <w:cnfStyle w:val="001000000000" w:firstRow="0" w:lastRow="0" w:firstColumn="1" w:lastColumn="0" w:oddVBand="0" w:evenVBand="0" w:oddHBand="0" w:evenHBand="0" w:firstRowFirstColumn="0" w:firstRowLastColumn="0" w:lastRowFirstColumn="0" w:lastRowLastColumn="0"/>
+            <w:tcW w:w="4887" w:type="dxa"/>
+          </w:tcPr>
+          <w:p>
+            <w:pPr>
+              <w:jc w:val="center"/>
+              <w:rPr>
+                <w:b w:val="0"/>
+              </w:rPr>
+            </w:pPr>
+            <w:r>
+              <w:rPr>
+                <w:b w:val="0"/>
+              </w:rPr>
+              <w:t>Block Memory Generator</w:t>
+            </w:r>
+          </w:p>
+        </w:tc>
+      </w:tr>
+    </w:tbl>
+    <w:p>
+      <w:pPr>
+        <w:pStyle w:val="berschrift2"/>
+        <w:rPr>
+          <w:color w:val="EE0000"/>
+          <w:lang w:val="en-US"/>
+        </w:rPr>
+      </w:pPr>
+      <w:r>
+        <w:rPr>
+          <w:color w:val="EE0000"/>
           <w:lang w:val="en-US"/>
         </w:rPr>
         <w:lastRenderedPageBreak/>
         <w:t>Implementation</w:t>
       </w:r>
-      <w:bookmarkEnd w:id="2"/>
       <w:bookmarkEnd w:id="3"/>
+      <w:bookmarkEnd w:id="4"/>
+      <w:r>
+        <w:rPr>
+          <w:color w:val="EE0000"/>
+          <w:lang w:val="en-US"/>
+        </w:rPr>
+        <w:t>----- Continue from here</w:t>
+      </w:r>
     </w:p>
+    <w:bookmarkStart w:id="5" w:name="_Toc216095052"/>
+    <w:bookmarkStart w:id="6" w:name="_Toc216367281"/>
     <w:p>
       <w:pPr>
-        <w:pStyle w:val="berschrift2"/>
-      </w:pPr>
-      <w:bookmarkStart w:id="7" w:name="_Toc216095052"/>
-      <w:bookmarkStart w:id="8" w:name="_Toc216367281"/>
+        <w:pStyle w:val="berschrift3"/>
+      </w:pPr>
       <w:r>
         <w:rPr>
           <w:noProof/>
@@ -1249,8 +1624,8 @@
                                 <w:szCs w:val="26"/>
                               </w:rPr>
                             </w:pPr>
-                            <w:bookmarkStart w:id="9" w:name="_Ref216088365"/>
-                            <w:bookmarkStart w:id="10" w:name="_Ref216088361"/>
+                            <w:bookmarkStart w:id="7" w:name="_Ref216088365"/>
+                            <w:bookmarkStart w:id="8" w:name="_Ref216088361"/>
                             <w:r>
                               <w:t xml:space="preserve">Figure </w:t>
                             </w:r>
@@ -1272,11 +1647,11 @@
                             <w:r>
                               <w:fldChar w:fldCharType="end"/>
                             </w:r>
-                            <w:bookmarkEnd w:id="9"/>
+                            <w:bookmarkEnd w:id="7"/>
                             <w:r>
                               <w:t xml:space="preserve">: </w:t>
                             </w:r>
-                            <w:bookmarkEnd w:id="10"/>
+                            <w:bookmarkEnd w:id="8"/>
                             <w:r>
                               <w:t>Block diagram of the</w:t>
                             </w:r>
@@ -1382,7 +1757,7 @@
                     <pic:cNvPicPr/>
                   </pic:nvPicPr>
                   <pic:blipFill>
-                    <a:blip r:embed="rId18" cstate="print">
+                    <a:blip r:embed="rId16" cstate="print">
                       <a:extLst>
                         <a:ext uri="{28A0092B-C50C-407E-A947-70E740481C1C}">
                           <a14:useLocalDpi xmlns:a14="http://schemas.microsoft.com/office/drawing/2010/main" val="0"/>
@@ -1426,8 +1801,8 @@
       <w:r>
         <w:t>diagram</w:t>
       </w:r>
-      <w:bookmarkEnd w:id="7"/>
-      <w:bookmarkEnd w:id="8"/>
+      <w:bookmarkEnd w:id="5"/>
+      <w:bookmarkEnd w:id="6"/>
     </w:p>
     <w:p>
       <w:r>
@@ -1473,17 +1848,12 @@
       <w:pPr>
         <w:pStyle w:val="berschrift2"/>
       </w:pPr>
-      <w:bookmarkStart w:id="13" w:name="_Toc216367282"/>
+      <w:bookmarkStart w:id="9" w:name="_Toc216367282"/>
       <w:r>
         <w:lastRenderedPageBreak/>
-        <w:t xml:space="preserve">Waveform </w:t>
-      </w:r>
-      <w:proofErr w:type="spellStart"/>
-      <w:r>
-        <w:t>shreenshots</w:t>
-      </w:r>
-      <w:bookmarkEnd w:id="13"/>
-      <w:proofErr w:type="spellEnd"/>
+        <w:t>Waveform shreenshots</w:t>
+      </w:r>
+      <w:bookmarkEnd w:id="9"/>
     </w:p>
     <w:p>
       <w:r>
@@ -1491,7 +1861,7 @@
           <w:noProof/>
         </w:rPr>
         <w:drawing>
-          <wp:anchor distT="0" distB="0" distL="114300" distR="114300" simplePos="0" relativeHeight="251658245" behindDoc="0" locked="0" layoutInCell="1" allowOverlap="1" wp14:anchorId="265DE5B0" wp14:editId="07FD18CB">
+          <wp:anchor distT="0" distB="0" distL="114300" distR="114300" simplePos="0" relativeHeight="251658245" behindDoc="0" locked="0" layoutInCell="1" allowOverlap="1" wp14:anchorId="265DE5B0" wp14:editId="1101492B">
             <wp:simplePos x="0" y="0"/>
             <wp:positionH relativeFrom="margin">
               <wp:align>left</wp:align>
@@ -1514,7 +1884,7 @@
                     <pic:cNvPicPr/>
                   </pic:nvPicPr>
                   <pic:blipFill>
-                    <a:blip r:embed="rId19" cstate="print">
+                    <a:blip r:embed="rId17" cstate="print">
                       <a:extLst>
                         <a:ext uri="{28A0092B-C50C-407E-A947-70E740481C1C}">
                           <a14:useLocalDpi xmlns:a14="http://schemas.microsoft.com/office/drawing/2010/main" val="0"/>
@@ -1699,7 +2069,6 @@
       <w:r>
         <w:t xml:space="preserve"> to see how the result distributed. Our </w:t>
       </w:r>
-      <w:proofErr w:type="spellStart"/>
       <w:r>
         <w:rPr>
           <w:i/>
@@ -1707,7 +2076,6 @@
         </w:rPr>
         <w:t>dice_val_cnt</w:t>
       </w:r>
-      <w:proofErr w:type="spellEnd"/>
       <w:r>
         <w:t xml:space="preserve"> </w:t>
       </w:r>
@@ -2045,7 +2413,7 @@
         <w:fldChar w:fldCharType="begin"/>
       </w:r>
       <w:r>
-        <w:instrText xml:space="preserve"> SEQ Table \* ARABIC </w:instrText>
+        <w:instrText xml:space="preserve"> STYLEREF 1 \s </w:instrText>
       </w:r>
       <w:r>
         <w:fldChar w:fldCharType="separate"/>
@@ -2054,7 +2422,28 @@
         <w:rPr>
           <w:noProof/>
         </w:rPr>
-        <w:t>1</w:t>
+        <w:t>2</w:t>
+      </w:r>
+      <w:r>
+        <w:fldChar w:fldCharType="end"/>
+      </w:r>
+      <w:r>
+        <w:t>.</w:t>
+      </w:r>
+      <w:r>
+        <w:fldChar w:fldCharType="begin"/>
+      </w:r>
+      <w:r>
+        <w:instrText xml:space="preserve"> SEQ Table \* ARABIC \s 1 </w:instrText>
+      </w:r>
+      <w:r>
+        <w:fldChar w:fldCharType="separate"/>
+      </w:r>
+      <w:r>
+        <w:rPr>
+          <w:noProof/>
+        </w:rPr>
+        <w:t>2</w:t>
       </w:r>
       <w:r>
         <w:fldChar w:fldCharType="end"/>
@@ -2126,7 +2515,7 @@
         </w:rPr>
         <w:lastRenderedPageBreak/>
         <w:drawing>
-          <wp:anchor distT="0" distB="0" distL="114300" distR="114300" simplePos="0" relativeHeight="251658248" behindDoc="0" locked="0" layoutInCell="1" allowOverlap="1" wp14:anchorId="462CEAC5" wp14:editId="7FF57E59">
+          <wp:anchor distT="0" distB="0" distL="114300" distR="114300" simplePos="0" relativeHeight="251658248" behindDoc="0" locked="0" layoutInCell="1" allowOverlap="1" wp14:anchorId="462CEAC5" wp14:editId="5A6C8A44">
             <wp:simplePos x="0" y="0"/>
             <wp:positionH relativeFrom="margin">
               <wp:posOffset>10160</wp:posOffset>
@@ -2149,7 +2538,7 @@
                     <pic:cNvPicPr/>
                   </pic:nvPicPr>
                   <pic:blipFill rotWithShape="1">
-                    <a:blip r:embed="rId20" cstate="print">
+                    <a:blip r:embed="rId18" cstate="print">
                       <a:extLst>
                         <a:ext uri="{28A0092B-C50C-407E-A947-70E740481C1C}">
                           <a14:useLocalDpi xmlns:a14="http://schemas.microsoft.com/office/drawing/2010/main" val="0"/>
@@ -2337,14 +2726,12 @@
       <w:r>
         <w:t xml:space="preserve"> The signal </w:t>
       </w:r>
-      <w:proofErr w:type="spellStart"/>
       <w:r>
         <w:rPr>
           <w:i/>
         </w:rPr>
         <w:t>dice_done_o</w:t>
       </w:r>
-      <w:proofErr w:type="spellEnd"/>
       <w:r>
         <w:t xml:space="preserve"> </w:t>
       </w:r>
@@ -2389,11 +2776,11 @@
       <w:pPr>
         <w:pStyle w:val="berschrift2"/>
       </w:pPr>
-      <w:bookmarkStart w:id="14" w:name="_Toc216367283"/>
+      <w:bookmarkStart w:id="10" w:name="_Toc216367283"/>
       <w:r>
         <w:t>RTL Code</w:t>
       </w:r>
-      <w:bookmarkEnd w:id="14"/>
+      <w:bookmarkEnd w:id="10"/>
     </w:p>
     <w:p>
       <w:r>
@@ -2402,47 +2789,30 @@
       <w:r>
         <w:t xml:space="preserve">readability the variable name </w:t>
       </w:r>
-      <w:proofErr w:type="spellStart"/>
       <w:r>
         <w:rPr>
           <w:i/>
         </w:rPr>
         <w:t>shift_register_values_intern_eight_bit</w:t>
       </w:r>
-      <w:proofErr w:type="spellEnd"/>
       <w:r>
         <w:t xml:space="preserve"> </w:t>
       </w:r>
       <w:r>
-        <w:t xml:space="preserve">which is used in our </w:t>
-      </w:r>
-      <w:proofErr w:type="spellStart"/>
-      <w:r>
-        <w:t>SystemVerilog</w:t>
-      </w:r>
-      <w:proofErr w:type="spellEnd"/>
-      <w:r>
-        <w:t xml:space="preserve"> simulations and </w:t>
-      </w:r>
-      <w:proofErr w:type="spellStart"/>
-      <w:r>
-        <w:t>sourcecode</w:t>
-      </w:r>
-      <w:proofErr w:type="spellEnd"/>
-      <w:r>
-        <w:t xml:space="preserve"> has </w:t>
+        <w:t xml:space="preserve">which is used in our SystemVerilog simulations and </w:t>
+      </w:r>
+      <w:r>
+        <w:t xml:space="preserve">sourcecode has </w:t>
       </w:r>
       <w:r>
         <w:t xml:space="preserve">in the following RTL code been changed to </w:t>
       </w:r>
-      <w:proofErr w:type="spellStart"/>
       <w:r>
         <w:rPr>
           <w:i/>
         </w:rPr>
         <w:t>r_name</w:t>
       </w:r>
-      <w:proofErr w:type="spellEnd"/>
       <w:r>
         <w:t>.</w:t>
       </w:r>
@@ -2530,42 +2900,18 @@
                 <w:szCs w:val="20"/>
                 <w:lang w:val="de-DE"/>
               </w:rPr>
-              <w:t>`</w:t>
-            </w:r>
-            <w:proofErr w:type="spellStart"/>
-            <w:r>
-              <w:rPr>
-                <w:rFonts w:ascii="Courier New" w:hAnsi="Courier New" w:cs="Courier New"/>
-                <w:color w:val="804000"/>
+              <w:t>`default_nettype</w:t>
+            </w:r>
+            <w:r>
+              <w:rPr>
+                <w:rFonts w:ascii="Courier New" w:hAnsi="Courier New" w:cs="Courier New"/>
+                <w:color w:val="000000"/>
                 <w:sz w:val="20"/>
                 <w:szCs w:val="20"/>
                 <w:lang w:val="de-DE"/>
               </w:rPr>
-              <w:t>default_nettype</w:t>
-            </w:r>
-            <w:proofErr w:type="spellEnd"/>
-            <w:r>
-              <w:rPr>
-                <w:rFonts w:ascii="Courier New" w:hAnsi="Courier New" w:cs="Courier New"/>
-                <w:color w:val="000000"/>
-                <w:sz w:val="20"/>
-                <w:szCs w:val="20"/>
-                <w:lang w:val="de-DE"/>
-              </w:rPr>
-              <w:t xml:space="preserve"> </w:t>
-            </w:r>
-            <w:proofErr w:type="spellStart"/>
-            <w:r>
-              <w:rPr>
-                <w:rFonts w:ascii="Courier New" w:hAnsi="Courier New" w:cs="Courier New"/>
-                <w:color w:val="000000"/>
-                <w:sz w:val="20"/>
-                <w:szCs w:val="20"/>
-                <w:lang w:val="de-DE"/>
-              </w:rPr>
-              <w:t>none</w:t>
-            </w:r>
-            <w:proofErr w:type="spellEnd"/>
+              <w:t xml:space="preserve"> none</w:t>
+            </w:r>
           </w:p>
           <w:p>
             <w:pPr>
@@ -2587,7 +2933,6 @@
                 <w:lang w:val="de-DE"/>
               </w:rPr>
             </w:pPr>
-            <w:proofErr w:type="spellStart"/>
             <w:r>
               <w:rPr>
                 <w:rFonts w:ascii="Courier New" w:hAnsi="Courier New" w:cs="Courier New"/>
@@ -2600,7 +2945,6 @@
               </w:rPr>
               <w:t>module</w:t>
             </w:r>
-            <w:proofErr w:type="spellEnd"/>
             <w:r>
               <w:rPr>
                 <w:rFonts w:ascii="Courier New" w:hAnsi="Courier New" w:cs="Courier New"/>
@@ -2609,29 +2953,7 @@
                 <w:szCs w:val="20"/>
                 <w:lang w:val="de-DE"/>
               </w:rPr>
-              <w:t xml:space="preserve"> </w:t>
-            </w:r>
-            <w:proofErr w:type="spellStart"/>
-            <w:r>
-              <w:rPr>
-                <w:rFonts w:ascii="Courier New" w:hAnsi="Courier New" w:cs="Courier New"/>
-                <w:color w:val="000000"/>
-                <w:sz w:val="20"/>
-                <w:szCs w:val="20"/>
-                <w:lang w:val="de-DE"/>
-              </w:rPr>
-              <w:t>ste_dice_module</w:t>
-            </w:r>
-            <w:proofErr w:type="spellEnd"/>
-            <w:r>
-              <w:rPr>
-                <w:rFonts w:ascii="Courier New" w:hAnsi="Courier New" w:cs="Courier New"/>
-                <w:color w:val="000000"/>
-                <w:sz w:val="20"/>
-                <w:szCs w:val="20"/>
-                <w:lang w:val="de-DE"/>
-              </w:rPr>
-              <w:t xml:space="preserve"> </w:t>
+              <w:t xml:space="preserve"> ste_dice_module </w:t>
             </w:r>
             <w:r>
               <w:rPr>
@@ -2898,7 +3220,6 @@
               </w:rPr>
               <w:t xml:space="preserve"> </w:t>
             </w:r>
-            <w:proofErr w:type="spellStart"/>
             <w:r>
               <w:rPr>
                 <w:rFonts w:ascii="Courier New" w:hAnsi="Courier New" w:cs="Courier New"/>
@@ -2906,17 +3227,7 @@
                 <w:sz w:val="20"/>
                 <w:szCs w:val="20"/>
               </w:rPr>
-              <w:t>clk</w:t>
-            </w:r>
-            <w:proofErr w:type="spellEnd"/>
-            <w:r>
-              <w:rPr>
-                <w:rFonts w:ascii="Courier New" w:hAnsi="Courier New" w:cs="Courier New"/>
-                <w:color w:val="000000"/>
-                <w:sz w:val="20"/>
-                <w:szCs w:val="20"/>
-              </w:rPr>
-              <w:t xml:space="preserve">             </w:t>
+              <w:t xml:space="preserve">clk             </w:t>
             </w:r>
             <w:r>
               <w:rPr>
@@ -3009,7 +3320,6 @@
               </w:rPr>
               <w:t xml:space="preserve"> </w:t>
             </w:r>
-            <w:proofErr w:type="spellStart"/>
             <w:r>
               <w:rPr>
                 <w:rFonts w:ascii="Courier New" w:hAnsi="Courier New" w:cs="Courier New"/>
@@ -3017,17 +3327,7 @@
                 <w:sz w:val="20"/>
                 <w:szCs w:val="20"/>
               </w:rPr>
-              <w:t>reset_ni</w:t>
-            </w:r>
-            <w:proofErr w:type="spellEnd"/>
-            <w:r>
-              <w:rPr>
-                <w:rFonts w:ascii="Courier New" w:hAnsi="Courier New" w:cs="Courier New"/>
-                <w:color w:val="000000"/>
-                <w:sz w:val="20"/>
-                <w:szCs w:val="20"/>
-              </w:rPr>
-              <w:t xml:space="preserve">        </w:t>
+              <w:t xml:space="preserve">reset_ni        </w:t>
             </w:r>
             <w:r>
               <w:rPr>
@@ -3170,27 +3470,7 @@
                 <w:sz w:val="20"/>
                 <w:szCs w:val="20"/>
               </w:rPr>
-              <w:t xml:space="preserve"> </w:t>
-            </w:r>
-            <w:proofErr w:type="spellStart"/>
-            <w:r>
-              <w:rPr>
-                <w:rFonts w:ascii="Courier New" w:hAnsi="Courier New" w:cs="Courier New"/>
-                <w:color w:val="000000"/>
-                <w:sz w:val="20"/>
-                <w:szCs w:val="20"/>
-              </w:rPr>
-              <w:t>trig_pls</w:t>
-            </w:r>
-            <w:proofErr w:type="spellEnd"/>
-            <w:r>
-              <w:rPr>
-                <w:rFonts w:ascii="Courier New" w:hAnsi="Courier New" w:cs="Courier New"/>
-                <w:color w:val="000000"/>
-                <w:sz w:val="20"/>
-                <w:szCs w:val="20"/>
-              </w:rPr>
-              <w:t xml:space="preserve">        </w:t>
+              <w:t xml:space="preserve"> trig_pls        </w:t>
             </w:r>
             <w:r>
               <w:rPr>
@@ -3219,27 +3499,7 @@
                 <w:sz w:val="20"/>
                 <w:szCs w:val="20"/>
               </w:rPr>
-              <w:t xml:space="preserve">// I  1; </w:t>
-            </w:r>
-            <w:proofErr w:type="spellStart"/>
-            <w:r>
-              <w:rPr>
-                <w:rFonts w:ascii="Courier New" w:hAnsi="Courier New" w:cs="Courier New"/>
-                <w:color w:val="008000"/>
-                <w:sz w:val="20"/>
-                <w:szCs w:val="20"/>
-              </w:rPr>
-              <w:t>Center</w:t>
-            </w:r>
-            <w:proofErr w:type="spellEnd"/>
-            <w:r>
-              <w:rPr>
-                <w:rFonts w:ascii="Courier New" w:hAnsi="Courier New" w:cs="Courier New"/>
-                <w:color w:val="008000"/>
-                <w:sz w:val="20"/>
-                <w:szCs w:val="20"/>
-              </w:rPr>
-              <w:t xml:space="preserve"> </w:t>
+              <w:t xml:space="preserve">// I  1; Center </w:t>
             </w:r>
           </w:p>
           <w:p>
@@ -3328,27 +3588,7 @@
                 <w:sz w:val="20"/>
                 <w:szCs w:val="20"/>
               </w:rPr>
-              <w:t xml:space="preserve"> </w:t>
-            </w:r>
-            <w:proofErr w:type="spellStart"/>
-            <w:r>
-              <w:rPr>
-                <w:rFonts w:ascii="Courier New" w:hAnsi="Courier New" w:cs="Courier New"/>
-                <w:color w:val="000000"/>
-                <w:sz w:val="20"/>
-                <w:szCs w:val="20"/>
-              </w:rPr>
-              <w:t>dice_done_o</w:t>
-            </w:r>
-            <w:proofErr w:type="spellEnd"/>
-            <w:r>
-              <w:rPr>
-                <w:rFonts w:ascii="Courier New" w:hAnsi="Courier New" w:cs="Courier New"/>
-                <w:color w:val="000000"/>
-                <w:sz w:val="20"/>
-                <w:szCs w:val="20"/>
-              </w:rPr>
-              <w:t xml:space="preserve">     </w:t>
+              <w:t xml:space="preserve"> dice_done_o     </w:t>
             </w:r>
             <w:r>
               <w:rPr>
@@ -3497,27 +3737,7 @@
                 <w:sz w:val="20"/>
                 <w:szCs w:val="20"/>
               </w:rPr>
-              <w:t xml:space="preserve"> </w:t>
-            </w:r>
-            <w:proofErr w:type="spellStart"/>
-            <w:r>
-              <w:rPr>
-                <w:rFonts w:ascii="Courier New" w:hAnsi="Courier New" w:cs="Courier New"/>
-                <w:color w:val="000000"/>
-                <w:sz w:val="20"/>
-                <w:szCs w:val="20"/>
-              </w:rPr>
-              <w:t>dice_dout_o</w:t>
-            </w:r>
-            <w:proofErr w:type="spellEnd"/>
-            <w:r>
-              <w:rPr>
-                <w:rFonts w:ascii="Courier New" w:hAnsi="Courier New" w:cs="Courier New"/>
-                <w:color w:val="000000"/>
-                <w:sz w:val="20"/>
-                <w:szCs w:val="20"/>
-              </w:rPr>
-              <w:t xml:space="preserve">       </w:t>
+              <w:t xml:space="preserve"> dice_dout_o       </w:t>
             </w:r>
             <w:r>
               <w:rPr>
@@ -3746,7 +3966,6 @@
               </w:rPr>
               <w:t xml:space="preserve"> </w:t>
             </w:r>
-            <w:proofErr w:type="spellStart"/>
             <w:r>
               <w:rPr>
                 <w:rFonts w:ascii="Courier New" w:hAnsi="Courier New" w:cs="Courier New"/>
@@ -3756,7 +3975,6 @@
               </w:rPr>
               <w:t>r_name</w:t>
             </w:r>
-            <w:proofErr w:type="spellEnd"/>
             <w:r>
               <w:rPr>
                 <w:rFonts w:ascii="Courier New" w:hAnsi="Courier New" w:cs="Courier New"/>
@@ -3891,7 +4109,6 @@
                 <w:szCs w:val="20"/>
               </w:rPr>
             </w:pPr>
-            <w:proofErr w:type="spellStart"/>
             <w:r>
               <w:rPr>
                 <w:rFonts w:ascii="Courier New" w:hAnsi="Courier New" w:cs="Courier New"/>
@@ -3903,7 +4120,6 @@
               </w:rPr>
               <w:t>always_ff</w:t>
             </w:r>
-            <w:proofErr w:type="spellEnd"/>
             <w:r>
               <w:rPr>
                 <w:rFonts w:ascii="Courier New" w:hAnsi="Courier New" w:cs="Courier New"/>
@@ -3942,27 +4158,7 @@
                 <w:sz w:val="20"/>
                 <w:szCs w:val="20"/>
               </w:rPr>
-              <w:t xml:space="preserve"> </w:t>
-            </w:r>
-            <w:proofErr w:type="spellStart"/>
-            <w:r>
-              <w:rPr>
-                <w:rFonts w:ascii="Courier New" w:hAnsi="Courier New" w:cs="Courier New"/>
-                <w:color w:val="000000"/>
-                <w:sz w:val="20"/>
-                <w:szCs w:val="20"/>
-              </w:rPr>
-              <w:t>clk</w:t>
-            </w:r>
-            <w:proofErr w:type="spellEnd"/>
-            <w:r>
-              <w:rPr>
-                <w:rFonts w:ascii="Courier New" w:hAnsi="Courier New" w:cs="Courier New"/>
-                <w:color w:val="000000"/>
-                <w:sz w:val="20"/>
-                <w:szCs w:val="20"/>
-              </w:rPr>
-              <w:t xml:space="preserve"> </w:t>
+              <w:t xml:space="preserve"> clk </w:t>
             </w:r>
             <w:r>
               <w:rPr>
@@ -3984,7 +4180,6 @@
               </w:rPr>
               <w:t xml:space="preserve"> </w:t>
             </w:r>
-            <w:proofErr w:type="spellStart"/>
             <w:r>
               <w:rPr>
                 <w:rFonts w:ascii="Courier New" w:hAnsi="Courier New" w:cs="Courier New"/>
@@ -3996,7 +4191,6 @@
               </w:rPr>
               <w:t>negedge</w:t>
             </w:r>
-            <w:proofErr w:type="spellEnd"/>
             <w:r>
               <w:rPr>
                 <w:rFonts w:ascii="Courier New" w:hAnsi="Courier New" w:cs="Courier New"/>
@@ -4004,19 +4198,8 @@
                 <w:sz w:val="20"/>
                 <w:szCs w:val="20"/>
               </w:rPr>
-              <w:t xml:space="preserve"> </w:t>
-            </w:r>
-            <w:proofErr w:type="spellStart"/>
-            <w:r>
-              <w:rPr>
-                <w:rFonts w:ascii="Courier New" w:hAnsi="Courier New" w:cs="Courier New"/>
-                <w:color w:val="000000"/>
-                <w:sz w:val="20"/>
-                <w:szCs w:val="20"/>
-              </w:rPr>
-              <w:t>reset_ni</w:t>
-            </w:r>
-            <w:proofErr w:type="spellEnd"/>
+              <w:t xml:space="preserve"> reset_ni</w:t>
+            </w:r>
             <w:r>
               <w:rPr>
                 <w:rFonts w:ascii="Courier New" w:hAnsi="Courier New" w:cs="Courier New"/>
@@ -4101,7 +4284,6 @@
               </w:rPr>
               <w:t>(~</w:t>
             </w:r>
-            <w:proofErr w:type="spellStart"/>
             <w:r>
               <w:rPr>
                 <w:rFonts w:ascii="Courier New" w:hAnsi="Courier New" w:cs="Courier New"/>
@@ -4111,7 +4293,6 @@
               </w:rPr>
               <w:t>reset_ni</w:t>
             </w:r>
-            <w:proofErr w:type="spellEnd"/>
             <w:r>
               <w:rPr>
                 <w:rFonts w:ascii="Courier New" w:hAnsi="Courier New" w:cs="Courier New"/>
@@ -4181,19 +4362,8 @@
                 <w:sz w:val="20"/>
                 <w:szCs w:val="20"/>
               </w:rPr>
-              <w:t xml:space="preserve">   </w:t>
-            </w:r>
-            <w:proofErr w:type="spellStart"/>
-            <w:r>
-              <w:rPr>
-                <w:rFonts w:ascii="Courier New" w:hAnsi="Courier New" w:cs="Courier New"/>
-                <w:color w:val="000000"/>
-                <w:sz w:val="20"/>
-                <w:szCs w:val="20"/>
-              </w:rPr>
-              <w:t>r_name</w:t>
-            </w:r>
-            <w:proofErr w:type="spellEnd"/>
+              <w:t xml:space="preserve">   r_name</w:t>
+            </w:r>
             <w:r>
               <w:rPr>
                 <w:rFonts w:ascii="Courier New" w:hAnsi="Courier New" w:cs="Courier New"/>
@@ -4265,7 +4435,6 @@
               </w:rPr>
               <w:t xml:space="preserve">   </w:t>
             </w:r>
-            <w:proofErr w:type="spellStart"/>
             <w:r>
               <w:rPr>
                 <w:rFonts w:ascii="Courier New" w:hAnsi="Courier New" w:cs="Courier New"/>
@@ -4274,18 +4443,7 @@
                 <w:szCs w:val="20"/>
                 <w:lang w:val="it-IT"/>
               </w:rPr>
-              <w:t>dice_done_o</w:t>
-            </w:r>
-            <w:proofErr w:type="spellEnd"/>
-            <w:r>
-              <w:rPr>
-                <w:rFonts w:ascii="Courier New" w:hAnsi="Courier New" w:cs="Courier New"/>
-                <w:color w:val="000000"/>
-                <w:sz w:val="20"/>
-                <w:szCs w:val="20"/>
-                <w:lang w:val="it-IT"/>
-              </w:rPr>
-              <w:t xml:space="preserve"> </w:t>
+              <w:t xml:space="preserve">dice_done_o </w:t>
             </w:r>
             <w:r>
               <w:rPr>
@@ -4363,7 +4521,6 @@
               </w:rPr>
               <w:t xml:space="preserve">   </w:t>
             </w:r>
-            <w:proofErr w:type="spellStart"/>
             <w:r>
               <w:rPr>
                 <w:rFonts w:ascii="Courier New" w:hAnsi="Courier New" w:cs="Courier New"/>
@@ -4372,18 +4529,7 @@
                 <w:szCs w:val="20"/>
                 <w:lang w:val="it-IT"/>
               </w:rPr>
-              <w:t>dice_dout_o</w:t>
-            </w:r>
-            <w:proofErr w:type="spellEnd"/>
-            <w:r>
-              <w:rPr>
-                <w:rFonts w:ascii="Courier New" w:hAnsi="Courier New" w:cs="Courier New"/>
-                <w:color w:val="000000"/>
-                <w:sz w:val="20"/>
-                <w:szCs w:val="20"/>
-                <w:lang w:val="it-IT"/>
-              </w:rPr>
-              <w:t xml:space="preserve"> </w:t>
+              <w:t xml:space="preserve">dice_dout_o </w:t>
             </w:r>
             <w:r>
               <w:rPr>
@@ -4522,7 +4668,6 @@
               </w:rPr>
               <w:t>(</w:t>
             </w:r>
-            <w:proofErr w:type="spellStart"/>
             <w:r>
               <w:rPr>
                 <w:rFonts w:ascii="Courier New" w:hAnsi="Courier New" w:cs="Courier New"/>
@@ -4532,7 +4677,6 @@
               </w:rPr>
               <w:t>trig_pls</w:t>
             </w:r>
-            <w:proofErr w:type="spellEnd"/>
             <w:r>
               <w:rPr>
                 <w:rFonts w:ascii="Courier New" w:hAnsi="Courier New" w:cs="Courier New"/>
@@ -4606,7 +4750,6 @@
               </w:rPr>
               <w:t xml:space="preserve">   </w:t>
             </w:r>
-            <w:proofErr w:type="spellStart"/>
             <w:r>
               <w:rPr>
                 <w:rFonts w:ascii="Courier New" w:hAnsi="Courier New" w:cs="Courier New"/>
@@ -4616,7 +4759,6 @@
               </w:rPr>
               <w:t>r_name</w:t>
             </w:r>
-            <w:proofErr w:type="spellEnd"/>
             <w:r>
               <w:rPr>
                 <w:rFonts w:ascii="Courier New" w:hAnsi="Courier New" w:cs="Courier New"/>
@@ -4659,7 +4801,6 @@
               </w:rPr>
               <w:t>{</w:t>
             </w:r>
-            <w:proofErr w:type="spellStart"/>
             <w:r>
               <w:rPr>
                 <w:rFonts w:ascii="Courier New" w:hAnsi="Courier New" w:cs="Courier New"/>
@@ -4669,7 +4810,6 @@
               </w:rPr>
               <w:t>r_name</w:t>
             </w:r>
-            <w:proofErr w:type="spellEnd"/>
             <w:r>
               <w:rPr>
                 <w:rFonts w:ascii="Courier New" w:hAnsi="Courier New" w:cs="Courier New"/>
@@ -4721,7 +4861,6 @@
               </w:rPr>
               <w:t>],(</w:t>
             </w:r>
-            <w:proofErr w:type="spellStart"/>
             <w:r>
               <w:rPr>
                 <w:rFonts w:ascii="Courier New" w:hAnsi="Courier New" w:cs="Courier New"/>
@@ -4731,7 +4870,6 @@
               </w:rPr>
               <w:t>r_name</w:t>
             </w:r>
-            <w:proofErr w:type="spellEnd"/>
             <w:r>
               <w:rPr>
                 <w:rFonts w:ascii="Courier New" w:hAnsi="Courier New" w:cs="Courier New"/>
@@ -4792,7 +4930,6 @@
               </w:rPr>
               <w:t xml:space="preserve"> </w:t>
             </w:r>
-            <w:proofErr w:type="spellStart"/>
             <w:r>
               <w:rPr>
                 <w:rFonts w:ascii="Courier New" w:hAnsi="Courier New" w:cs="Courier New"/>
@@ -4802,7 +4939,6 @@
               </w:rPr>
               <w:t>r_name</w:t>
             </w:r>
-            <w:proofErr w:type="spellEnd"/>
             <w:r>
               <w:rPr>
                 <w:rFonts w:ascii="Courier New" w:hAnsi="Courier New" w:cs="Courier New"/>
@@ -4863,7 +4999,6 @@
               </w:rPr>
               <w:t xml:space="preserve"> </w:t>
             </w:r>
-            <w:proofErr w:type="spellStart"/>
             <w:r>
               <w:rPr>
                 <w:rFonts w:ascii="Courier New" w:hAnsi="Courier New" w:cs="Courier New"/>
@@ -4873,7 +5008,6 @@
               </w:rPr>
               <w:t>r_name</w:t>
             </w:r>
-            <w:proofErr w:type="spellEnd"/>
             <w:r>
               <w:rPr>
                 <w:rFonts w:ascii="Courier New" w:hAnsi="Courier New" w:cs="Courier New"/>
@@ -4934,7 +5068,6 @@
               </w:rPr>
               <w:t xml:space="preserve"> </w:t>
             </w:r>
-            <w:proofErr w:type="spellStart"/>
             <w:r>
               <w:rPr>
                 <w:rFonts w:ascii="Courier New" w:hAnsi="Courier New" w:cs="Courier New"/>
@@ -4944,7 +5077,6 @@
               </w:rPr>
               <w:t>r_name</w:t>
             </w:r>
-            <w:proofErr w:type="spellEnd"/>
             <w:r>
               <w:rPr>
                 <w:rFonts w:ascii="Courier New" w:hAnsi="Courier New" w:cs="Courier New"/>
@@ -5005,7 +5137,6 @@
               </w:rPr>
               <w:t xml:space="preserve">   </w:t>
             </w:r>
-            <w:proofErr w:type="spellStart"/>
             <w:r>
               <w:rPr>
                 <w:rFonts w:ascii="Courier New" w:hAnsi="Courier New" w:cs="Courier New"/>
@@ -5013,17 +5144,7 @@
                 <w:sz w:val="20"/>
                 <w:szCs w:val="20"/>
               </w:rPr>
-              <w:t>dice_done_o</w:t>
-            </w:r>
-            <w:proofErr w:type="spellEnd"/>
-            <w:r>
-              <w:rPr>
-                <w:rFonts w:ascii="Courier New" w:hAnsi="Courier New" w:cs="Courier New"/>
-                <w:color w:val="000000"/>
-                <w:sz w:val="20"/>
-                <w:szCs w:val="20"/>
-              </w:rPr>
-              <w:t xml:space="preserve"> </w:t>
+              <w:t xml:space="preserve">dice_done_o </w:t>
             </w:r>
             <w:r>
               <w:rPr>
@@ -5096,7 +5217,6 @@
               </w:rPr>
               <w:t xml:space="preserve">   </w:t>
             </w:r>
-            <w:proofErr w:type="spellStart"/>
             <w:r>
               <w:rPr>
                 <w:rFonts w:ascii="Courier New" w:hAnsi="Courier New" w:cs="Courier New"/>
@@ -5105,18 +5225,7 @@
                 <w:szCs w:val="20"/>
                 <w:lang w:val="pt-PT"/>
               </w:rPr>
-              <w:t>dice_dout_o</w:t>
-            </w:r>
-            <w:proofErr w:type="spellEnd"/>
-            <w:r>
-              <w:rPr>
-                <w:rFonts w:ascii="Courier New" w:hAnsi="Courier New" w:cs="Courier New"/>
-                <w:color w:val="000000"/>
-                <w:sz w:val="20"/>
-                <w:szCs w:val="20"/>
-                <w:lang w:val="pt-PT"/>
-              </w:rPr>
-              <w:t xml:space="preserve"> </w:t>
+              <w:t xml:space="preserve">dice_dout_o </w:t>
             </w:r>
             <w:r>
               <w:rPr>
@@ -5140,7 +5249,6 @@
               </w:rPr>
               <w:t xml:space="preserve"> </w:t>
             </w:r>
-            <w:proofErr w:type="spellStart"/>
             <w:r>
               <w:rPr>
                 <w:rFonts w:ascii="Courier New" w:hAnsi="Courier New" w:cs="Courier New"/>
@@ -5151,7 +5259,6 @@
               </w:rPr>
               <w:t>r_name</w:t>
             </w:r>
-            <w:proofErr w:type="spellEnd"/>
             <w:r>
               <w:rPr>
                 <w:rFonts w:ascii="Courier New" w:hAnsi="Courier New" w:cs="Courier New"/>
@@ -5372,7 +5479,6 @@
               </w:rPr>
               <w:t xml:space="preserve">   </w:t>
             </w:r>
-            <w:proofErr w:type="spellStart"/>
             <w:r>
               <w:rPr>
                 <w:rFonts w:ascii="Courier New" w:hAnsi="Courier New" w:cs="Courier New"/>
@@ -5380,17 +5486,7 @@
                 <w:sz w:val="20"/>
                 <w:szCs w:val="20"/>
               </w:rPr>
-              <w:t>dice_done_o</w:t>
-            </w:r>
-            <w:proofErr w:type="spellEnd"/>
-            <w:r>
-              <w:rPr>
-                <w:rFonts w:ascii="Courier New" w:hAnsi="Courier New" w:cs="Courier New"/>
-                <w:color w:val="000000"/>
-                <w:sz w:val="20"/>
-                <w:szCs w:val="20"/>
-              </w:rPr>
-              <w:t xml:space="preserve"> </w:t>
+              <w:t xml:space="preserve">dice_done_o </w:t>
             </w:r>
             <w:r>
               <w:rPr>
@@ -5519,7 +5615,6 @@
                 <w:lang w:val="da-DK"/>
               </w:rPr>
             </w:pPr>
-            <w:proofErr w:type="spellStart"/>
             <w:r>
               <w:rPr>
                 <w:rFonts w:ascii="Courier New" w:hAnsi="Courier New" w:cs="Courier New"/>
@@ -5532,7 +5627,6 @@
               </w:rPr>
               <w:t>endmodule</w:t>
             </w:r>
-            <w:proofErr w:type="spellEnd"/>
           </w:p>
           <w:p>
             <w:pPr>
@@ -5562,20 +5656,8 @@
                 <w:szCs w:val="20"/>
                 <w:lang w:val="da-DK"/>
               </w:rPr>
-              <w:t>`</w:t>
-            </w:r>
-            <w:proofErr w:type="spellStart"/>
-            <w:r>
-              <w:rPr>
-                <w:rFonts w:ascii="Courier New" w:hAnsi="Courier New" w:cs="Courier New"/>
-                <w:color w:val="804000"/>
-                <w:sz w:val="20"/>
-                <w:szCs w:val="20"/>
-                <w:lang w:val="da-DK"/>
-              </w:rPr>
-              <w:t>default_nettype</w:t>
-            </w:r>
-            <w:proofErr w:type="spellEnd"/>
+              <w:t>`default_nettype</w:t>
+            </w:r>
             <w:r>
               <w:rPr>
                 <w:rFonts w:ascii="Courier New" w:hAnsi="Courier New" w:cs="Courier New"/>
@@ -5614,15 +5696,7 @@
         <w:t xml:space="preserve">The 8-bit register is loaded with </w:t>
       </w:r>
       <w:r>
-        <w:t xml:space="preserve">an </w:t>
-      </w:r>
-      <w:proofErr w:type="spellStart"/>
-      <w:r>
-        <w:t>inital</w:t>
-      </w:r>
-      <w:proofErr w:type="spellEnd"/>
-      <w:r>
-        <w:t xml:space="preserve"> value, which was chosen different for each of the dices. </w:t>
+        <w:t xml:space="preserve">an inital value, which was chosen different for each of the dices. </w:t>
       </w:r>
       <w:r>
         <w:t>This value gets loaded into the register at every reset that is appl</w:t>
@@ -5673,14 +5747,12 @@
       <w:r>
         <w:t xml:space="preserve">The </w:t>
       </w:r>
-      <w:proofErr w:type="spellStart"/>
       <w:r>
         <w:rPr>
           <w:i/>
         </w:rPr>
         <w:t>trig_pls</w:t>
       </w:r>
-      <w:proofErr w:type="spellEnd"/>
       <w:r>
         <w:t xml:space="preserve"> signal which starts </w:t>
       </w:r>
@@ -5693,14 +5765,12 @@
       <w:r>
         <w:t xml:space="preserve">comes from the </w:t>
       </w:r>
-      <w:proofErr w:type="spellStart"/>
       <w:r>
         <w:rPr>
           <w:i/>
         </w:rPr>
         <w:t>btnC</w:t>
       </w:r>
-      <w:proofErr w:type="spellEnd"/>
       <w:r>
         <w:t xml:space="preserve"> signal in the testbench (Line 8 is the input definition and in Line 28 it is used to start the calculation).</w:t>
       </w:r>
@@ -5781,63 +5851,7 @@
         <w:rPr>
           <w:lang w:val="da-DK"/>
         </w:rPr>
-        <w:t xml:space="preserve">This </w:t>
-      </w:r>
-      <w:proofErr w:type="spellStart"/>
-      <w:r>
-        <w:rPr>
-          <w:lang w:val="da-DK"/>
-        </w:rPr>
-        <w:t>calculation</w:t>
-      </w:r>
-      <w:proofErr w:type="spellEnd"/>
-      <w:r>
-        <w:rPr>
-          <w:lang w:val="da-DK"/>
-        </w:rPr>
-        <w:t xml:space="preserve"> </w:t>
-      </w:r>
-      <w:proofErr w:type="spellStart"/>
-      <w:r>
-        <w:rPr>
-          <w:lang w:val="da-DK"/>
-        </w:rPr>
-        <w:t>can</w:t>
-      </w:r>
-      <w:proofErr w:type="spellEnd"/>
-      <w:r>
-        <w:rPr>
-          <w:lang w:val="da-DK"/>
-        </w:rPr>
-        <w:t xml:space="preserve"> </w:t>
-      </w:r>
-      <w:proofErr w:type="spellStart"/>
-      <w:r>
-        <w:rPr>
-          <w:lang w:val="da-DK"/>
-        </w:rPr>
-        <w:t>be</w:t>
-      </w:r>
-      <w:proofErr w:type="spellEnd"/>
-      <w:r>
-        <w:rPr>
-          <w:lang w:val="da-DK"/>
-        </w:rPr>
-        <w:t xml:space="preserve"> </w:t>
-      </w:r>
-      <w:proofErr w:type="spellStart"/>
-      <w:r>
-        <w:rPr>
-          <w:lang w:val="da-DK"/>
-        </w:rPr>
-        <w:t>seen</w:t>
-      </w:r>
-      <w:proofErr w:type="spellEnd"/>
-      <w:r>
-        <w:rPr>
-          <w:lang w:val="da-DK"/>
-        </w:rPr>
-        <w:t xml:space="preserve"> in Line 32. </w:t>
+        <w:t xml:space="preserve">This calculation can be seen in Line 32. </w:t>
       </w:r>
       <w:r>
         <w:rPr>
@@ -5850,16 +5864,16 @@
       <w:pPr>
         <w:pStyle w:val="berschrift2"/>
       </w:pPr>
-      <w:bookmarkStart w:id="15" w:name="_Toc216367284"/>
+      <w:bookmarkStart w:id="11" w:name="_Toc216367284"/>
       <w:r>
         <w:lastRenderedPageBreak/>
         <w:t>Photos of the FPGA board</w:t>
       </w:r>
-      <w:bookmarkEnd w:id="15"/>
+      <w:bookmarkEnd w:id="11"/>
     </w:p>
-    <w:bookmarkEnd w:id="4"/>
-    <w:bookmarkEnd w:id="5"/>
-    <w:bookmarkEnd w:id="6"/>
+    <w:bookmarkEnd w:id="0"/>
+    <w:bookmarkEnd w:id="1"/>
+    <w:bookmarkEnd w:id="2"/>
     <w:p>
       <w:r>
         <w:rPr>
@@ -5911,7 +5925,7 @@
                                 <w:szCs w:val="22"/>
                               </w:rPr>
                             </w:pPr>
-                            <w:bookmarkStart w:id="16" w:name="_Ref216367591"/>
+                            <w:bookmarkStart w:id="12" w:name="_Ref216367591"/>
                             <w:r>
                               <w:t xml:space="preserve">Figure </w:t>
                             </w:r>
@@ -5933,7 +5947,7 @@
                             <w:r>
                               <w:fldChar w:fldCharType="end"/>
                             </w:r>
-                            <w:bookmarkEnd w:id="16"/>
+                            <w:bookmarkEnd w:id="12"/>
                             <w:r>
                               <w:t>: BASYS 3 FPGA Board after pressing the reset button.</w:t>
                             </w:r>
@@ -6032,7 +6046,7 @@
                     </pic:cNvPicPr>
                   </pic:nvPicPr>
                   <pic:blipFill rotWithShape="1">
-                    <a:blip r:embed="rId21" cstate="print">
+                    <a:blip r:embed="rId19" cstate="print">
                       <a:extLst>
                         <a:ext uri="{28A0092B-C50C-407E-A947-70E740481C1C}">
                           <a14:useLocalDpi xmlns:a14="http://schemas.microsoft.com/office/drawing/2010/main" val="0"/>
@@ -6380,7 +6394,7 @@
                     </pic:cNvPicPr>
                   </pic:nvPicPr>
                   <pic:blipFill rotWithShape="1">
-                    <a:blip r:embed="rId22" cstate="print">
+                    <a:blip r:embed="rId20" cstate="print">
                       <a:extLst>
                         <a:ext uri="{28A0092B-C50C-407E-A947-70E740481C1C}">
                           <a14:useLocalDpi xmlns:a14="http://schemas.microsoft.com/office/drawing/2010/main" val="0"/>
@@ -6607,7 +6621,7 @@
                     </pic:cNvPicPr>
                   </pic:nvPicPr>
                   <pic:blipFill rotWithShape="1">
-                    <a:blip r:embed="rId23" cstate="print">
+                    <a:blip r:embed="rId21" cstate="print">
                       <a:extLst>
                         <a:ext uri="{28A0092B-C50C-407E-A947-70E740481C1C}">
                           <a14:useLocalDpi xmlns:a14="http://schemas.microsoft.com/office/drawing/2010/main" val="0"/>
@@ -6715,7 +6729,7 @@
                       <wp:cNvGraphicFramePr/>
                       <a:graphic xmlns:a="http://schemas.openxmlformats.org/drawingml/2006/main">
                         <a:graphicData uri="http://schemas.microsoft.com/office/word/2010/wordprocessingInk">
-                          <w14:contentPart bwMode="auto" r:id="rId24">
+                          <w14:contentPart bwMode="auto" r:id="rId22">
                             <w14:nvContentPartPr>
                               <w14:cNvContentPartPr/>
                             </w14:nvContentPartPr>
@@ -6930,16 +6944,16 @@
           <w:lang w:val="en-US"/>
         </w:rPr>
       </w:pPr>
-      <w:bookmarkStart w:id="18" w:name="_Toc216095063"/>
-      <w:bookmarkStart w:id="19" w:name="_Toc216367285"/>
+      <w:bookmarkStart w:id="13" w:name="_Toc216095063"/>
+      <w:bookmarkStart w:id="14" w:name="_Toc216367285"/>
       <w:r>
         <w:rPr>
           <w:lang w:val="en-US"/>
         </w:rPr>
         <w:t>Date and Signature</w:t>
       </w:r>
-      <w:bookmarkEnd w:id="18"/>
-      <w:bookmarkEnd w:id="19"/>
+      <w:bookmarkEnd w:id="13"/>
+      <w:bookmarkEnd w:id="14"/>
     </w:p>
     <w:p>
       <w:pPr>
@@ -7063,36 +7077,26 @@
     <w:pPr>
       <w:pStyle w:val="Fuzeile"/>
     </w:pPr>
+    <w:r>
+      <w:t>30</w:t>
+    </w:r>
+    <w:r>
+      <w:t>.</w:t>
+    </w:r>
+    <w:r>
+      <w:t>09</w:t>
+    </w:r>
+    <w:r>
+      <w:t>.202</w:t>
+    </w:r>
+    <w:r>
+      <w:t>6</w:t>
+    </w:r>
   </w:p>
 </w:ftr>
 </file>
 
 <file path=word/footer2.xml><?xml version="1.0" encoding="utf-8"?>
-<w:ftr xmlns:wpc="http://schemas.microsoft.com/office/word/2010/wordprocessingCanvas" xmlns:cx="http://schemas.microsoft.com/office/drawing/2014/chartex" xmlns:cx1="http://schemas.microsoft.com/office/drawing/2015/9/8/chartex" xmlns:cx2="http://schemas.microsoft.com/office/drawing/2015/10/21/chartex" xmlns:cx3="http://schemas.microsoft.com/office/drawing/2016/5/9/chartex" xmlns:cx4="http://schemas.microsoft.com/office/drawing/2016/5/10/chartex" xmlns:cx5="http://schemas.microsoft.com/office/drawing/2016/5/11/chartex" xmlns:cx6="http://schemas.microsoft.com/office/drawing/2016/5/12/chartex" xmlns:cx7="http://schemas.microsoft.com/office/drawing/2016/5/13/chartex" xmlns:cx8="http://schemas.microsoft.com/office/drawing/2016/5/14/chartex" xmlns:mc="http://schemas.openxmlformats.org/markup-compatibility/2006" xmlns:aink="http://schemas.microsoft.com/office/drawing/2016/ink" xmlns:am3d="http://schemas.microsoft.com/office/drawing/2017/model3d" xmlns:o="urn:schemas-microsoft-com:office:office" xmlns:oel="http://schemas.microsoft.com/office/2019/extlst" xmlns:r="http://schemas.openxmlformats.org/officeDocument/2006/relationships" xmlns:m="http://schemas.openxmlformats.org/officeDocument/2006/math" xmlns:v="urn:schemas-microsoft-com:vml" xmlns:wp14="http://schemas.microsoft.com/office/word/2010/wordprocessingDrawing" xmlns:wp="http://schemas.openxmlformats.org/drawingml/2006/wordprocessingDrawing" xmlns:w10="urn:schemas-microsoft-com:office:word" xmlns:w="http://schemas.openxmlformats.org/wordprocessingml/2006/main" xmlns:w14="http://schemas.microsoft.com/office/word/2010/wordml" xmlns:w15="http://schemas.microsoft.com/office/word/2012/wordml" xmlns:w16cex="http://schemas.microsoft.com/office/word/2018/wordml/cex" xmlns:w16cid="http://schemas.microsoft.com/office/word/2016/wordml/cid" xmlns:w16="http://schemas.microsoft.com/office/word/2018/wordml" xmlns:w16du="http://schemas.microsoft.com/office/word/2023/wordml/word16du" xmlns:w16sdtdh="http://schemas.microsoft.com/office/word/2020/wordml/sdtdatahash" xmlns:w16sdtfl="http://schemas.microsoft.com/office/word/2024/wordml/sdtformatlock" xmlns:w16se="http://schemas.microsoft.com/office/word/2015/wordml/symex" xmlns:wpg="http://schemas.microsoft.com/office/word/2010/wordprocessingGroup" xmlns:wpi="http://schemas.microsoft.com/office/word/2010/wordprocessingInk" xmlns:wne="http://schemas.microsoft.com/office/word/2006/wordml" xmlns:wps="http://schemas.microsoft.com/office/word/2010/wordprocessingShape" mc:Ignorable="w14 w15 w16se w16cid w16 w16cex w16sdtdh w16sdtfl w16du wp14">
-  <w:p>
-    <w:pPr>
-      <w:pStyle w:val="Fuzeile"/>
-    </w:pPr>
-    <w:r>
-      <w:t>28</w:t>
-    </w:r>
-    <w:r>
-      <w:t>.1</w:t>
-    </w:r>
-    <w:r>
-      <w:t>1</w:t>
-    </w:r>
-    <w:r>
-      <w:t>.202</w:t>
-    </w:r>
-    <w:r>
-      <w:t>5</w:t>
-    </w:r>
-  </w:p>
-</w:ftr>
-</file>
-
-<file path=word/footer3.xml><?xml version="1.0" encoding="utf-8"?>
 <w:ftr xmlns:wpc="http://schemas.microsoft.com/office/word/2010/wordprocessingCanvas" xmlns:cx="http://schemas.microsoft.com/office/drawing/2014/chartex" xmlns:cx1="http://schemas.microsoft.com/office/drawing/2015/9/8/chartex" xmlns:cx2="http://schemas.microsoft.com/office/drawing/2015/10/21/chartex" xmlns:cx3="http://schemas.microsoft.com/office/drawing/2016/5/9/chartex" xmlns:cx4="http://schemas.microsoft.com/office/drawing/2016/5/10/chartex" xmlns:cx5="http://schemas.microsoft.com/office/drawing/2016/5/11/chartex" xmlns:cx6="http://schemas.microsoft.com/office/drawing/2016/5/12/chartex" xmlns:cx7="http://schemas.microsoft.com/office/drawing/2016/5/13/chartex" xmlns:cx8="http://schemas.microsoft.com/office/drawing/2016/5/14/chartex" xmlns:mc="http://schemas.openxmlformats.org/markup-compatibility/2006" xmlns:aink="http://schemas.microsoft.com/office/drawing/2016/ink" xmlns:am3d="http://schemas.microsoft.com/office/drawing/2017/model3d" xmlns:o="urn:schemas-microsoft-com:office:office" xmlns:oel="http://schemas.microsoft.com/office/2019/extlst" xmlns:r="http://schemas.openxmlformats.org/officeDocument/2006/relationships" xmlns:m="http://schemas.openxmlformats.org/officeDocument/2006/math" xmlns:v="urn:schemas-microsoft-com:vml" xmlns:wp14="http://schemas.microsoft.com/office/word/2010/wordprocessingDrawing" xmlns:wp="http://schemas.openxmlformats.org/drawingml/2006/wordprocessingDrawing" xmlns:w10="urn:schemas-microsoft-com:office:word" xmlns:w="http://schemas.openxmlformats.org/wordprocessingml/2006/main" xmlns:w14="http://schemas.microsoft.com/office/word/2010/wordml" xmlns:w15="http://schemas.microsoft.com/office/word/2012/wordml" xmlns:w16cex="http://schemas.microsoft.com/office/word/2018/wordml/cex" xmlns:w16cid="http://schemas.microsoft.com/office/word/2016/wordml/cid" xmlns:w16="http://schemas.microsoft.com/office/word/2018/wordml" xmlns:w16du="http://schemas.microsoft.com/office/word/2023/wordml/word16du" xmlns:w16sdtdh="http://schemas.microsoft.com/office/word/2020/wordml/sdtdatahash" xmlns:w16sdtfl="http://schemas.microsoft.com/office/word/2024/wordml/sdtformatlock" xmlns:w16se="http://schemas.microsoft.com/office/word/2015/wordml/symex" xmlns:wpg="http://schemas.microsoft.com/office/word/2010/wordprocessingGroup" xmlns:wpi="http://schemas.microsoft.com/office/word/2010/wordprocessingInk" xmlns:wne="http://schemas.microsoft.com/office/word/2006/wordml" xmlns:wps="http://schemas.microsoft.com/office/word/2010/wordprocessingShape" mc:Ignorable="w14 w15 w16se w16cid w16 w16cex w16sdtdh w16sdtfl w16du wp14">
   <w:p>
     <w:pPr>
@@ -7120,7 +7124,7 @@
 </w:ftr>
 </file>
 
-<file path=word/footer4.xml><?xml version="1.0" encoding="utf-8"?>
+<file path=word/footer3.xml><?xml version="1.0" encoding="utf-8"?>
 <w:ftr xmlns:wpc="http://schemas.microsoft.com/office/word/2010/wordprocessingCanvas" xmlns:cx="http://schemas.microsoft.com/office/drawing/2014/chartex" xmlns:cx1="http://schemas.microsoft.com/office/drawing/2015/9/8/chartex" xmlns:cx2="http://schemas.microsoft.com/office/drawing/2015/10/21/chartex" xmlns:cx3="http://schemas.microsoft.com/office/drawing/2016/5/9/chartex" xmlns:cx4="http://schemas.microsoft.com/office/drawing/2016/5/10/chartex" xmlns:cx5="http://schemas.microsoft.com/office/drawing/2016/5/11/chartex" xmlns:cx6="http://schemas.microsoft.com/office/drawing/2016/5/12/chartex" xmlns:cx7="http://schemas.microsoft.com/office/drawing/2016/5/13/chartex" xmlns:cx8="http://schemas.microsoft.com/office/drawing/2016/5/14/chartex" xmlns:mc="http://schemas.openxmlformats.org/markup-compatibility/2006" xmlns:aink="http://schemas.microsoft.com/office/drawing/2016/ink" xmlns:am3d="http://schemas.microsoft.com/office/drawing/2017/model3d" xmlns:o="urn:schemas-microsoft-com:office:office" xmlns:oel="http://schemas.microsoft.com/office/2019/extlst" xmlns:r="http://schemas.openxmlformats.org/officeDocument/2006/relationships" xmlns:m="http://schemas.openxmlformats.org/officeDocument/2006/math" xmlns:v="urn:schemas-microsoft-com:vml" xmlns:wp14="http://schemas.microsoft.com/office/word/2010/wordprocessingDrawing" xmlns:wp="http://schemas.openxmlformats.org/drawingml/2006/wordprocessingDrawing" xmlns:w10="urn:schemas-microsoft-com:office:word" xmlns:w="http://schemas.openxmlformats.org/wordprocessingml/2006/main" xmlns:w14="http://schemas.microsoft.com/office/word/2010/wordml" xmlns:w15="http://schemas.microsoft.com/office/word/2012/wordml" xmlns:w16cex="http://schemas.microsoft.com/office/word/2018/wordml/cex" xmlns:w16cid="http://schemas.microsoft.com/office/word/2016/wordml/cid" xmlns:w16="http://schemas.microsoft.com/office/word/2018/wordml" xmlns:w16du="http://schemas.microsoft.com/office/word/2023/wordml/word16du" xmlns:w16sdtdh="http://schemas.microsoft.com/office/word/2020/wordml/sdtdatahash" xmlns:w16sdtfl="http://schemas.microsoft.com/office/word/2024/wordml/sdtformatlock" xmlns:w16se="http://schemas.microsoft.com/office/word/2015/wordml/symex" xmlns:wpg="http://schemas.microsoft.com/office/word/2010/wordprocessingGroup" xmlns:wpi="http://schemas.microsoft.com/office/word/2010/wordprocessingInk" xmlns:wne="http://schemas.microsoft.com/office/word/2006/wordml" xmlns:wps="http://schemas.microsoft.com/office/word/2010/wordprocessingShape" mc:Ignorable="w14 w15 w16se w16cid w16 w16cex w16sdtdh w16sdtfl w16du wp14">
   <w:p>
     <w:pPr>
@@ -7139,13 +7143,8 @@
       <w:fldChar w:fldCharType="separate"/>
     </w:r>
     <w:r>
-      <w:t>i</w:t>
+      <w:t>ii</w:t>
     </w:r>
-    <w:proofErr w:type="spellStart"/>
-    <w:r>
-      <w:t>i</w:t>
-    </w:r>
-    <w:proofErr w:type="spellEnd"/>
     <w:r>
       <w:fldChar w:fldCharType="end"/>
     </w:r>
@@ -7153,7 +7152,7 @@
 </w:ftr>
 </file>
 
-<file path=word/footer5.xml><?xml version="1.0" encoding="utf-8"?>
+<file path=word/footer4.xml><?xml version="1.0" encoding="utf-8"?>
 <w:ftr xmlns:wpc="http://schemas.microsoft.com/office/word/2010/wordprocessingCanvas" xmlns:cx="http://schemas.microsoft.com/office/drawing/2014/chartex" xmlns:cx1="http://schemas.microsoft.com/office/drawing/2015/9/8/chartex" xmlns:cx2="http://schemas.microsoft.com/office/drawing/2015/10/21/chartex" xmlns:cx3="http://schemas.microsoft.com/office/drawing/2016/5/9/chartex" xmlns:cx4="http://schemas.microsoft.com/office/drawing/2016/5/10/chartex" xmlns:cx5="http://schemas.microsoft.com/office/drawing/2016/5/11/chartex" xmlns:cx6="http://schemas.microsoft.com/office/drawing/2016/5/12/chartex" xmlns:cx7="http://schemas.microsoft.com/office/drawing/2016/5/13/chartex" xmlns:cx8="http://schemas.microsoft.com/office/drawing/2016/5/14/chartex" xmlns:mc="http://schemas.openxmlformats.org/markup-compatibility/2006" xmlns:aink="http://schemas.microsoft.com/office/drawing/2016/ink" xmlns:am3d="http://schemas.microsoft.com/office/drawing/2017/model3d" xmlns:o="urn:schemas-microsoft-com:office:office" xmlns:oel="http://schemas.microsoft.com/office/2019/extlst" xmlns:r="http://schemas.openxmlformats.org/officeDocument/2006/relationships" xmlns:m="http://schemas.openxmlformats.org/officeDocument/2006/math" xmlns:v="urn:schemas-microsoft-com:vml" xmlns:wp14="http://schemas.microsoft.com/office/word/2010/wordprocessingDrawing" xmlns:wp="http://schemas.openxmlformats.org/drawingml/2006/wordprocessingDrawing" xmlns:w10="urn:schemas-microsoft-com:office:word" xmlns:w="http://schemas.openxmlformats.org/wordprocessingml/2006/main" xmlns:w14="http://schemas.microsoft.com/office/word/2010/wordml" xmlns:w15="http://schemas.microsoft.com/office/word/2012/wordml" xmlns:w16cex="http://schemas.microsoft.com/office/word/2018/wordml/cex" xmlns:w16cid="http://schemas.microsoft.com/office/word/2016/wordml/cid" xmlns:w16="http://schemas.microsoft.com/office/word/2018/wordml" xmlns:w16du="http://schemas.microsoft.com/office/word/2023/wordml/word16du" xmlns:w16sdtdh="http://schemas.microsoft.com/office/word/2020/wordml/sdtdatahash" xmlns:w16sdtfl="http://schemas.microsoft.com/office/word/2024/wordml/sdtformatlock" xmlns:w16se="http://schemas.microsoft.com/office/word/2015/wordml/symex" xmlns:wpg="http://schemas.microsoft.com/office/word/2010/wordprocessingGroup" xmlns:wpi="http://schemas.microsoft.com/office/word/2010/wordprocessingInk" xmlns:wne="http://schemas.microsoft.com/office/word/2006/wordml" xmlns:wps="http://schemas.microsoft.com/office/word/2010/wordprocessingShape" mc:Ignorable="w14 w15 w16se w16cid w16 w16cex w16sdtdh w16sdtfl w16du wp14">
   <w:p>
     <w:pPr>
@@ -7171,13 +7170,8 @@
       <w:fldChar w:fldCharType="separate"/>
     </w:r>
     <w:r>
-      <w:t>vi</w:t>
+      <w:t>vii</w:t>
     </w:r>
-    <w:proofErr w:type="spellStart"/>
-    <w:r>
-      <w:t>i</w:t>
-    </w:r>
-    <w:proofErr w:type="spellEnd"/>
     <w:r>
       <w:fldChar w:fldCharType="end"/>
     </w:r>
@@ -7188,7 +7182,7 @@
 </w:ftr>
 </file>
 
-<file path=word/footer6.xml><?xml version="1.0" encoding="utf-8"?>
+<file path=word/footer5.xml><?xml version="1.0" encoding="utf-8"?>
 <w:ftr xmlns:wpc="http://schemas.microsoft.com/office/word/2010/wordprocessingCanvas" xmlns:cx="http://schemas.microsoft.com/office/drawing/2014/chartex" xmlns:cx1="http://schemas.microsoft.com/office/drawing/2015/9/8/chartex" xmlns:cx2="http://schemas.microsoft.com/office/drawing/2015/10/21/chartex" xmlns:cx3="http://schemas.microsoft.com/office/drawing/2016/5/9/chartex" xmlns:cx4="http://schemas.microsoft.com/office/drawing/2016/5/10/chartex" xmlns:cx5="http://schemas.microsoft.com/office/drawing/2016/5/11/chartex" xmlns:cx6="http://schemas.microsoft.com/office/drawing/2016/5/12/chartex" xmlns:cx7="http://schemas.microsoft.com/office/drawing/2016/5/13/chartex" xmlns:cx8="http://schemas.microsoft.com/office/drawing/2016/5/14/chartex" xmlns:mc="http://schemas.openxmlformats.org/markup-compatibility/2006" xmlns:aink="http://schemas.microsoft.com/office/drawing/2016/ink" xmlns:am3d="http://schemas.microsoft.com/office/drawing/2017/model3d" xmlns:o="urn:schemas-microsoft-com:office:office" xmlns:oel="http://schemas.microsoft.com/office/2019/extlst" xmlns:r="http://schemas.openxmlformats.org/officeDocument/2006/relationships" xmlns:m="http://schemas.openxmlformats.org/officeDocument/2006/math" xmlns:v="urn:schemas-microsoft-com:vml" xmlns:wp14="http://schemas.microsoft.com/office/word/2010/wordprocessingDrawing" xmlns:wp="http://schemas.openxmlformats.org/drawingml/2006/wordprocessingDrawing" xmlns:w10="urn:schemas-microsoft-com:office:word" xmlns:w="http://schemas.openxmlformats.org/wordprocessingml/2006/main" xmlns:w14="http://schemas.microsoft.com/office/word/2010/wordml" xmlns:w15="http://schemas.microsoft.com/office/word/2012/wordml" xmlns:w16cex="http://schemas.microsoft.com/office/word/2018/wordml/cex" xmlns:w16cid="http://schemas.microsoft.com/office/word/2016/wordml/cid" xmlns:w16="http://schemas.microsoft.com/office/word/2018/wordml" xmlns:w16du="http://schemas.microsoft.com/office/word/2023/wordml/word16du" xmlns:w16sdtdh="http://schemas.microsoft.com/office/word/2020/wordml/sdtdatahash" xmlns:w16sdtfl="http://schemas.microsoft.com/office/word/2024/wordml/sdtformatlock" xmlns:w16se="http://schemas.microsoft.com/office/word/2015/wordml/symex" xmlns:wpg="http://schemas.microsoft.com/office/word/2010/wordprocessingGroup" xmlns:wpi="http://schemas.microsoft.com/office/word/2010/wordprocessingInk" xmlns:wne="http://schemas.microsoft.com/office/word/2006/wordml" xmlns:wps="http://schemas.microsoft.com/office/word/2010/wordprocessingShape" mc:Ignorable="w14 w15 w16se w16cid w16 w16cex w16sdtdh w16sdtfl w16du wp14">
   <w:p>
     <w:pPr>
@@ -7263,16 +7257,6 @@
 <w:hdr xmlns:wpc="http://schemas.microsoft.com/office/word/2010/wordprocessingCanvas" xmlns:cx="http://schemas.microsoft.com/office/drawing/2014/chartex" xmlns:cx1="http://schemas.microsoft.com/office/drawing/2015/9/8/chartex" xmlns:cx2="http://schemas.microsoft.com/office/drawing/2015/10/21/chartex" xmlns:cx3="http://schemas.microsoft.com/office/drawing/2016/5/9/chartex" xmlns:cx4="http://schemas.microsoft.com/office/drawing/2016/5/10/chartex" xmlns:cx5="http://schemas.microsoft.com/office/drawing/2016/5/11/chartex" xmlns:cx6="http://schemas.microsoft.com/office/drawing/2016/5/12/chartex" xmlns:cx7="http://schemas.microsoft.com/office/drawing/2016/5/13/chartex" xmlns:cx8="http://schemas.microsoft.com/office/drawing/2016/5/14/chartex" xmlns:mc="http://schemas.openxmlformats.org/markup-compatibility/2006" xmlns:aink="http://schemas.microsoft.com/office/drawing/2016/ink" xmlns:am3d="http://schemas.microsoft.com/office/drawing/2017/model3d" xmlns:o="urn:schemas-microsoft-com:office:office" xmlns:oel="http://schemas.microsoft.com/office/2019/extlst" xmlns:r="http://schemas.openxmlformats.org/officeDocument/2006/relationships" xmlns:m="http://schemas.openxmlformats.org/officeDocument/2006/math" xmlns:v="urn:schemas-microsoft-com:vml" xmlns:wp14="http://schemas.microsoft.com/office/word/2010/wordprocessingDrawing" xmlns:wp="http://schemas.openxmlformats.org/drawingml/2006/wordprocessingDrawing" xmlns:w10="urn:schemas-microsoft-com:office:word" xmlns:w="http://schemas.openxmlformats.org/wordprocessingml/2006/main" xmlns:w14="http://schemas.microsoft.com/office/word/2010/wordml" xmlns:w15="http://schemas.microsoft.com/office/word/2012/wordml" xmlns:w16cex="http://schemas.microsoft.com/office/word/2018/wordml/cex" xmlns:w16cid="http://schemas.microsoft.com/office/word/2016/wordml/cid" xmlns:w16="http://schemas.microsoft.com/office/word/2018/wordml" xmlns:w16du="http://schemas.microsoft.com/office/word/2023/wordml/word16du" xmlns:w16sdtdh="http://schemas.microsoft.com/office/word/2020/wordml/sdtdatahash" xmlns:w16sdtfl="http://schemas.microsoft.com/office/word/2024/wordml/sdtformatlock" xmlns:w16se="http://schemas.microsoft.com/office/word/2015/wordml/symex" xmlns:wpg="http://schemas.microsoft.com/office/word/2010/wordprocessingGroup" xmlns:wpi="http://schemas.microsoft.com/office/word/2010/wordprocessingInk" xmlns:wne="http://schemas.microsoft.com/office/word/2006/wordml" xmlns:wps="http://schemas.microsoft.com/office/word/2010/wordprocessingShape" mc:Ignorable="w14 w15 w16se w16cid w16 w16cex w16sdtdh w16sdtfl w16du wp14">
   <w:p>
     <w:pPr>
-      <w:pStyle w:val="Kopfzeile"/>
-    </w:pPr>
-  </w:p>
-</w:hdr>
-</file>
-
-<file path=word/header3.xml><?xml version="1.0" encoding="utf-8"?>
-<w:hdr xmlns:wpc="http://schemas.microsoft.com/office/word/2010/wordprocessingCanvas" xmlns:cx="http://schemas.microsoft.com/office/drawing/2014/chartex" xmlns:cx1="http://schemas.microsoft.com/office/drawing/2015/9/8/chartex" xmlns:cx2="http://schemas.microsoft.com/office/drawing/2015/10/21/chartex" xmlns:cx3="http://schemas.microsoft.com/office/drawing/2016/5/9/chartex" xmlns:cx4="http://schemas.microsoft.com/office/drawing/2016/5/10/chartex" xmlns:cx5="http://schemas.microsoft.com/office/drawing/2016/5/11/chartex" xmlns:cx6="http://schemas.microsoft.com/office/drawing/2016/5/12/chartex" xmlns:cx7="http://schemas.microsoft.com/office/drawing/2016/5/13/chartex" xmlns:cx8="http://schemas.microsoft.com/office/drawing/2016/5/14/chartex" xmlns:mc="http://schemas.openxmlformats.org/markup-compatibility/2006" xmlns:aink="http://schemas.microsoft.com/office/drawing/2016/ink" xmlns:am3d="http://schemas.microsoft.com/office/drawing/2017/model3d" xmlns:o="urn:schemas-microsoft-com:office:office" xmlns:oel="http://schemas.microsoft.com/office/2019/extlst" xmlns:r="http://schemas.openxmlformats.org/officeDocument/2006/relationships" xmlns:m="http://schemas.openxmlformats.org/officeDocument/2006/math" xmlns:v="urn:schemas-microsoft-com:vml" xmlns:wp14="http://schemas.microsoft.com/office/word/2010/wordprocessingDrawing" xmlns:wp="http://schemas.openxmlformats.org/drawingml/2006/wordprocessingDrawing" xmlns:w10="urn:schemas-microsoft-com:office:word" xmlns:w="http://schemas.openxmlformats.org/wordprocessingml/2006/main" xmlns:w14="http://schemas.microsoft.com/office/word/2010/wordml" xmlns:w15="http://schemas.microsoft.com/office/word/2012/wordml" xmlns:w16cex="http://schemas.microsoft.com/office/word/2018/wordml/cex" xmlns:w16cid="http://schemas.microsoft.com/office/word/2016/wordml/cid" xmlns:w16="http://schemas.microsoft.com/office/word/2018/wordml" xmlns:w16du="http://schemas.microsoft.com/office/word/2023/wordml/word16du" xmlns:w16sdtdh="http://schemas.microsoft.com/office/word/2020/wordml/sdtdatahash" xmlns:w16sdtfl="http://schemas.microsoft.com/office/word/2024/wordml/sdtformatlock" xmlns:w16se="http://schemas.microsoft.com/office/word/2015/wordml/symex" xmlns:wpg="http://schemas.microsoft.com/office/word/2010/wordprocessingGroup" xmlns:wpi="http://schemas.microsoft.com/office/word/2010/wordprocessingInk" xmlns:wne="http://schemas.microsoft.com/office/word/2006/wordml" xmlns:wps="http://schemas.microsoft.com/office/word/2010/wordprocessingShape" mc:Ignorable="w14 w15 w16se w16cid w16 w16cex w16sdtdh w16sdtfl w16du wp14">
-  <w:p>
-    <w:pPr>
       <w:pStyle w:val="Bildtitel"/>
       <w:jc w:val="left"/>
       <w:rPr>
@@ -7291,7 +7275,7 @@
 </w:hdr>
 </file>
 
-<file path=word/header4.xml><?xml version="1.0" encoding="utf-8"?>
+<file path=word/header3.xml><?xml version="1.0" encoding="utf-8"?>
 <w:hdr xmlns:wpc="http://schemas.microsoft.com/office/word/2010/wordprocessingCanvas" xmlns:cx="http://schemas.microsoft.com/office/drawing/2014/chartex" xmlns:cx1="http://schemas.microsoft.com/office/drawing/2015/9/8/chartex" xmlns:cx2="http://schemas.microsoft.com/office/drawing/2015/10/21/chartex" xmlns:cx3="http://schemas.microsoft.com/office/drawing/2016/5/9/chartex" xmlns:cx4="http://schemas.microsoft.com/office/drawing/2016/5/10/chartex" xmlns:cx5="http://schemas.microsoft.com/office/drawing/2016/5/11/chartex" xmlns:cx6="http://schemas.microsoft.com/office/drawing/2016/5/12/chartex" xmlns:cx7="http://schemas.microsoft.com/office/drawing/2016/5/13/chartex" xmlns:cx8="http://schemas.microsoft.com/office/drawing/2016/5/14/chartex" xmlns:mc="http://schemas.openxmlformats.org/markup-compatibility/2006" xmlns:aink="http://schemas.microsoft.com/office/drawing/2016/ink" xmlns:am3d="http://schemas.microsoft.com/office/drawing/2017/model3d" xmlns:o="urn:schemas-microsoft-com:office:office" xmlns:oel="http://schemas.microsoft.com/office/2019/extlst" xmlns:r="http://schemas.openxmlformats.org/officeDocument/2006/relationships" xmlns:m="http://schemas.openxmlformats.org/officeDocument/2006/math" xmlns:v="urn:schemas-microsoft-com:vml" xmlns:wp14="http://schemas.microsoft.com/office/word/2010/wordprocessingDrawing" xmlns:wp="http://schemas.openxmlformats.org/drawingml/2006/wordprocessingDrawing" xmlns:w10="urn:schemas-microsoft-com:office:word" xmlns:w="http://schemas.openxmlformats.org/wordprocessingml/2006/main" xmlns:w14="http://schemas.microsoft.com/office/word/2010/wordml" xmlns:w15="http://schemas.microsoft.com/office/word/2012/wordml" xmlns:w16cex="http://schemas.microsoft.com/office/word/2018/wordml/cex" xmlns:w16cid="http://schemas.microsoft.com/office/word/2016/wordml/cid" xmlns:w16="http://schemas.microsoft.com/office/word/2018/wordml" xmlns:w16du="http://schemas.microsoft.com/office/word/2023/wordml/word16du" xmlns:w16sdtdh="http://schemas.microsoft.com/office/word/2020/wordml/sdtdatahash" xmlns:w16sdtfl="http://schemas.microsoft.com/office/word/2024/wordml/sdtformatlock" xmlns:w16se="http://schemas.microsoft.com/office/word/2015/wordml/symex" xmlns:wpg="http://schemas.microsoft.com/office/word/2010/wordprocessingGroup" xmlns:wpi="http://schemas.microsoft.com/office/word/2010/wordprocessingInk" xmlns:wne="http://schemas.microsoft.com/office/word/2006/wordml" xmlns:wps="http://schemas.microsoft.com/office/word/2010/wordprocessingShape" mc:Ignorable="w14 w15 w16se w16cid w16 w16cex w16sdtdh w16sdtfl w16du wp14">
   <w:p>
     <w:pPr>
@@ -7304,7 +7288,7 @@
 </w:hdr>
 </file>
 
-<file path=word/header5.xml><?xml version="1.0" encoding="utf-8"?>
+<file path=word/header4.xml><?xml version="1.0" encoding="utf-8"?>
 <w:hdr xmlns:wpc="http://schemas.microsoft.com/office/word/2010/wordprocessingCanvas" xmlns:cx="http://schemas.microsoft.com/office/drawing/2014/chartex" xmlns:cx1="http://schemas.microsoft.com/office/drawing/2015/9/8/chartex" xmlns:cx2="http://schemas.microsoft.com/office/drawing/2015/10/21/chartex" xmlns:cx3="http://schemas.microsoft.com/office/drawing/2016/5/9/chartex" xmlns:cx4="http://schemas.microsoft.com/office/drawing/2016/5/10/chartex" xmlns:cx5="http://schemas.microsoft.com/office/drawing/2016/5/11/chartex" xmlns:cx6="http://schemas.microsoft.com/office/drawing/2016/5/12/chartex" xmlns:cx7="http://schemas.microsoft.com/office/drawing/2016/5/13/chartex" xmlns:cx8="http://schemas.microsoft.com/office/drawing/2016/5/14/chartex" xmlns:mc="http://schemas.openxmlformats.org/markup-compatibility/2006" xmlns:aink="http://schemas.microsoft.com/office/drawing/2016/ink" xmlns:am3d="http://schemas.microsoft.com/office/drawing/2017/model3d" xmlns:o="urn:schemas-microsoft-com:office:office" xmlns:oel="http://schemas.microsoft.com/office/2019/extlst" xmlns:r="http://schemas.openxmlformats.org/officeDocument/2006/relationships" xmlns:m="http://schemas.openxmlformats.org/officeDocument/2006/math" xmlns:v="urn:schemas-microsoft-com:vml" xmlns:wp14="http://schemas.microsoft.com/office/word/2010/wordprocessingDrawing" xmlns:wp="http://schemas.openxmlformats.org/drawingml/2006/wordprocessingDrawing" xmlns:w10="urn:schemas-microsoft-com:office:word" xmlns:w="http://schemas.openxmlformats.org/wordprocessingml/2006/main" xmlns:w14="http://schemas.microsoft.com/office/word/2010/wordml" xmlns:w15="http://schemas.microsoft.com/office/word/2012/wordml" xmlns:w16cex="http://schemas.microsoft.com/office/word/2018/wordml/cex" xmlns:w16cid="http://schemas.microsoft.com/office/word/2016/wordml/cid" xmlns:w16="http://schemas.microsoft.com/office/word/2018/wordml" xmlns:w16du="http://schemas.microsoft.com/office/word/2023/wordml/word16du" xmlns:w16sdtdh="http://schemas.microsoft.com/office/word/2020/wordml/sdtdatahash" xmlns:w16sdtfl="http://schemas.microsoft.com/office/word/2024/wordml/sdtformatlock" xmlns:w16se="http://schemas.microsoft.com/office/word/2015/wordml/symex" xmlns:wpg="http://schemas.microsoft.com/office/word/2010/wordprocessingGroup" xmlns:wpi="http://schemas.microsoft.com/office/word/2010/wordprocessingInk" xmlns:wne="http://schemas.microsoft.com/office/word/2006/wordml" xmlns:wps="http://schemas.microsoft.com/office/word/2010/wordprocessingShape" mc:Ignorable="w14 w15 w16se w16cid w16 w16cex w16sdtdh w16sdtfl w16du wp14">
   <w:p>
     <w:pPr>
@@ -7374,7 +7358,7 @@
         <w:noProof/>
         <w:color w:val="auto"/>
       </w:rPr>
-      <w:t>Implementation</w:t>
+      <w:t>Laboratory 1: Block Design</w:t>
     </w:r>
     <w:r>
       <w:rPr>
@@ -7391,7 +7375,7 @@
 </w:hdr>
 </file>
 
-<file path=word/header6.xml><?xml version="1.0" encoding="utf-8"?>
+<file path=word/header5.xml><?xml version="1.0" encoding="utf-8"?>
 <w:hdr xmlns:wpc="http://schemas.microsoft.com/office/word/2010/wordprocessingCanvas" xmlns:cx="http://schemas.microsoft.com/office/drawing/2014/chartex" xmlns:cx1="http://schemas.microsoft.com/office/drawing/2015/9/8/chartex" xmlns:cx2="http://schemas.microsoft.com/office/drawing/2015/10/21/chartex" xmlns:cx3="http://schemas.microsoft.com/office/drawing/2016/5/9/chartex" xmlns:cx4="http://schemas.microsoft.com/office/drawing/2016/5/10/chartex" xmlns:cx5="http://schemas.microsoft.com/office/drawing/2016/5/11/chartex" xmlns:cx6="http://schemas.microsoft.com/office/drawing/2016/5/12/chartex" xmlns:cx7="http://schemas.microsoft.com/office/drawing/2016/5/13/chartex" xmlns:cx8="http://schemas.microsoft.com/office/drawing/2016/5/14/chartex" xmlns:mc="http://schemas.openxmlformats.org/markup-compatibility/2006" xmlns:aink="http://schemas.microsoft.com/office/drawing/2016/ink" xmlns:am3d="http://schemas.microsoft.com/office/drawing/2017/model3d" xmlns:o="urn:schemas-microsoft-com:office:office" xmlns:oel="http://schemas.microsoft.com/office/2019/extlst" xmlns:r="http://schemas.openxmlformats.org/officeDocument/2006/relationships" xmlns:m="http://schemas.openxmlformats.org/officeDocument/2006/math" xmlns:v="urn:schemas-microsoft-com:vml" xmlns:wp14="http://schemas.microsoft.com/office/word/2010/wordprocessingDrawing" xmlns:wp="http://schemas.openxmlformats.org/drawingml/2006/wordprocessingDrawing" xmlns:w10="urn:schemas-microsoft-com:office:word" xmlns:w="http://schemas.openxmlformats.org/wordprocessingml/2006/main" xmlns:w14="http://schemas.microsoft.com/office/word/2010/wordml" xmlns:w15="http://schemas.microsoft.com/office/word/2012/wordml" xmlns:w16cex="http://schemas.microsoft.com/office/word/2018/wordml/cex" xmlns:w16cid="http://schemas.microsoft.com/office/word/2016/wordml/cid" xmlns:w16="http://schemas.microsoft.com/office/word/2018/wordml" xmlns:w16du="http://schemas.microsoft.com/office/word/2023/wordml/word16du" xmlns:w16sdtdh="http://schemas.microsoft.com/office/word/2020/wordml/sdtdatahash" xmlns:w16sdtfl="http://schemas.microsoft.com/office/word/2024/wordml/sdtformatlock" xmlns:w16se="http://schemas.microsoft.com/office/word/2015/wordml/symex" xmlns:wpg="http://schemas.microsoft.com/office/word/2010/wordprocessingGroup" xmlns:wpi="http://schemas.microsoft.com/office/word/2010/wordprocessingInk" xmlns:wne="http://schemas.microsoft.com/office/word/2006/wordml" xmlns:wps="http://schemas.microsoft.com/office/word/2010/wordprocessingShape" mc:Ignorable="w14 w15 w16se w16cid w16 w16cex w16sdtdh w16sdtfl w16du wp14">
   <w:p>
     <w:pPr>
@@ -7458,7 +7442,7 @@
         <w:noProof/>
         <w:color w:val="auto"/>
       </w:rPr>
-      <w:t>Task description</w:t>
+      <w:t>Task Description</w:t>
     </w:r>
     <w:r>
       <w:rPr>
@@ -8817,7 +8801,6 @@
   <w:style w:type="character" w:default="1" w:styleId="Absatz-Standardschriftart">
     <w:name w:val="Default Paragraph Font"/>
     <w:uiPriority w:val="1"/>
-    <w:semiHidden/>
     <w:unhideWhenUsed/>
   </w:style>
   <w:style w:type="table" w:default="1" w:styleId="NormaleTabelle">
@@ -9786,6 +9769,82 @@
       <w:szCs w:val="24"/>
     </w:rPr>
   </w:style>
+  <w:style w:type="table" w:styleId="Gitternetztabelle4Akzent1">
+    <w:name w:val="Grid Table 4 Accent 1"/>
+    <w:basedOn w:val="NormaleTabelle"/>
+    <w:uiPriority w:val="49"/>
+    <w:rsid w:val="00312693"/>
+    <w:pPr>
+      <w:spacing w:after="0" w:line="240" w:lineRule="auto"/>
+    </w:pPr>
+    <w:tblPr>
+      <w:tblStyleRowBandSize w:val="1"/>
+      <w:tblStyleColBandSize w:val="1"/>
+      <w:tblBorders>
+        <w:top w:val="single" w:sz="4" w:space="0" w:color="95B3D7" w:themeColor="accent1" w:themeTint="99"/>
+        <w:left w:val="single" w:sz="4" w:space="0" w:color="95B3D7" w:themeColor="accent1" w:themeTint="99"/>
+        <w:bottom w:val="single" w:sz="4" w:space="0" w:color="95B3D7" w:themeColor="accent1" w:themeTint="99"/>
+        <w:right w:val="single" w:sz="4" w:space="0" w:color="95B3D7" w:themeColor="accent1" w:themeTint="99"/>
+        <w:insideH w:val="single" w:sz="4" w:space="0" w:color="95B3D7" w:themeColor="accent1" w:themeTint="99"/>
+        <w:insideV w:val="single" w:sz="4" w:space="0" w:color="95B3D7" w:themeColor="accent1" w:themeTint="99"/>
+      </w:tblBorders>
+    </w:tblPr>
+    <w:tblStylePr w:type="firstRow">
+      <w:rPr>
+        <w:b/>
+        <w:bCs/>
+        <w:color w:val="FFFFFF" w:themeColor="background1"/>
+      </w:rPr>
+      <w:tblPr/>
+      <w:tcPr>
+        <w:tcBorders>
+          <w:top w:val="single" w:sz="4" w:space="0" w:color="4F81BD" w:themeColor="accent1"/>
+          <w:left w:val="single" w:sz="4" w:space="0" w:color="4F81BD" w:themeColor="accent1"/>
+          <w:bottom w:val="single" w:sz="4" w:space="0" w:color="4F81BD" w:themeColor="accent1"/>
+          <w:right w:val="single" w:sz="4" w:space="0" w:color="4F81BD" w:themeColor="accent1"/>
+          <w:insideH w:val="nil"/>
+          <w:insideV w:val="nil"/>
+        </w:tcBorders>
+        <w:shd w:val="clear" w:color="auto" w:fill="4F81BD" w:themeFill="accent1"/>
+      </w:tcPr>
+    </w:tblStylePr>
+    <w:tblStylePr w:type="lastRow">
+      <w:rPr>
+        <w:b/>
+        <w:bCs/>
+      </w:rPr>
+      <w:tblPr/>
+      <w:tcPr>
+        <w:tcBorders>
+          <w:top w:val="double" w:sz="4" w:space="0" w:color="4F81BD" w:themeColor="accent1"/>
+        </w:tcBorders>
+      </w:tcPr>
+    </w:tblStylePr>
+    <w:tblStylePr w:type="firstCol">
+      <w:rPr>
+        <w:b/>
+        <w:bCs/>
+      </w:rPr>
+    </w:tblStylePr>
+    <w:tblStylePr w:type="lastCol">
+      <w:rPr>
+        <w:b/>
+        <w:bCs/>
+      </w:rPr>
+    </w:tblStylePr>
+    <w:tblStylePr w:type="band1Vert">
+      <w:tblPr/>
+      <w:tcPr>
+        <w:shd w:val="clear" w:color="auto" w:fill="DBE5F1" w:themeFill="accent1" w:themeFillTint="33"/>
+      </w:tcPr>
+    </w:tblStylePr>
+    <w:tblStylePr w:type="band1Horz">
+      <w:tblPr/>
+      <w:tcPr>
+        <w:shd w:val="clear" w:color="auto" w:fill="DBE5F1" w:themeFill="accent1" w:themeFillTint="33"/>
+      </w:tcPr>
+    </w:tblStylePr>
+  </w:style>
 </w:styles>
 </file>
 

</xml_diff>